<commit_message>
Fix v6 Skills Library docx: resolve Word schema error (nested w:p in w:pPr)
TOC insertion now anchors to cover paragraph close tag instead of Section 1
opening tag, eliminating paragraph nesting violation. Patched from fresh v5
unpack to ensure clean base.

Co-Authored-By: Claude Sonnet 4.6 <noreply@anthropic.com>
</commit_message>
<xml_diff>
--- a/docs/Claude_Skill_Library_External (Finance)_v6.docx
+++ b/docs/Claude_Skill_Library_External (Finance)_v6.docx
@@ -53,714 +53,714 @@
     </w:p>
     <w:p>
       <w:pPr>
-        <w:p>
-          <w:pPr>
-            <w:spacing w:before="200" w:after="80"/>
-          </w:pPr>
-          <w:r>
-            <w:rPr>
-              <w:rFonts w:ascii="Wix Madefor Display SemiBold" w:hAnsi="Wix Madefor Display SemiBold" w:cs="Wix Madefor Display SemiBold"/>
-              <w:b/>
-              <w:bCs/>
-              <w:color w:val="4280F4"/>
-              <w:sz w:val="18"/>
-              <w:szCs w:val="18"/>
-            </w:rPr>
-            <w:t>Contents</w:t>
-          </w:r>
-        </w:p>
-        <w:tbl>
-          <w:tblPr>
-            <w:tblW w:w="10800" w:type="dxa"/>
-            <w:tblBorders>
-              <w:top w:val="single" w:sz="4" w:space="0" w:color="DDDDDD"/>
-              <w:left w:val="single" w:sz="4" w:space="0" w:color="DDDDDD"/>
-              <w:bottom w:val="single" w:sz="4" w:space="0" w:color="DDDDDD"/>
-              <w:right w:val="single" w:sz="4" w:space="0" w:color="DDDDDD"/>
-              <w:insideH w:val="single" w:sz="4" w:space="0" w:color="DDDDDD"/>
-              <w:insideV w:val="single" w:sz="4" w:space="0" w:color="DDDDDD"/>
-            </w:tblBorders>
-            <w:tblCellMar>
-              <w:top w:w="80" w:type="dxa"/>
-              <w:left w:w="120" w:type="dxa"/>
-              <w:bottom w:w="80" w:type="dxa"/>
-              <w:right w:w="120" w:type="dxa"/>
-            </w:tblCellMar>
-          </w:tblPr>
-          <w:tblGrid>
-            <w:gridCol w:w="800"/>
-            <w:gridCol w:w="10000"/>
-          </w:tblGrid>
-          <w:tr>
-            <w:tc>
-              <w:tcPr>
-                <w:tcW w:w="800" w:type="dxa"/>
-                <w:tcBorders>
-                  <w:top w:val="single" w:sz="4" w:space="0" w:color="DDDDDD"/>
-                  <w:left w:val="single" w:sz="4" w:space="0" w:color="DDDDDD"/>
-                  <w:bottom w:val="single" w:sz="4" w:space="0" w:color="DDDDDD"/>
-                  <w:right w:val="single" w:sz="4" w:space="0" w:color="DDDDDD"/>
-                </w:tcBorders>
-                <w:shd w:val="clear" w:color="auto" w:fill="0F4761"/>
-                <w:tcMar>
-                  <w:top w:w="80" w:type="dxa"/>
-                  <w:left w:w="120" w:type="dxa"/>
-                  <w:bottom w:w="80" w:type="dxa"/>
-                  <w:right w:w="120" w:type="dxa"/>
-                </w:tcMar>
-              </w:tcPr>
-              <w:p>
-                <w:r>
-                  <w:rPr>
-                    <w:rFonts w:ascii="Wix Madefor Display SemiBold" w:hAnsi="Wix Madefor Display SemiBold" w:cs="Wix Madefor Display SemiBold"/>
-                    <w:b/>
-                    <w:bCs/>
-                    <w:color w:val="FFFFFF"/>
-                    <w:sz w:val="15"/>
-                    <w:szCs w:val="15"/>
-                  </w:rPr>
-                  <w:t xml:space="preserve">#</w:t>
-                </w:r>
-              </w:p>
-            </w:tc>
-            <w:tc>
-              <w:tcPr>
-                <w:tcW w:w="10000" w:type="dxa"/>
-                <w:tcBorders>
-                  <w:top w:val="single" w:sz="4" w:space="0" w:color="DDDDDD"/>
-                  <w:left w:val="single" w:sz="4" w:space="0" w:color="DDDDDD"/>
-                  <w:bottom w:val="single" w:sz="4" w:space="0" w:color="DDDDDD"/>
-                  <w:right w:val="single" w:sz="4" w:space="0" w:color="DDDDDD"/>
-                </w:tcBorders>
-                <w:shd w:val="clear" w:color="auto" w:fill="0F4761"/>
-                <w:tcMar>
-                  <w:top w:w="80" w:type="dxa"/>
-                  <w:left w:w="120" w:type="dxa"/>
-                  <w:bottom w:w="80" w:type="dxa"/>
-                  <w:right w:w="120" w:type="dxa"/>
-                </w:tcMar>
-              </w:tcPr>
-              <w:p>
-                <w:r>
-                  <w:rPr>
-                    <w:rFonts w:ascii="Wix Madefor Display SemiBold" w:hAnsi="Wix Madefor Display SemiBold" w:cs="Wix Madefor Display SemiBold"/>
-                    <w:b/>
-                    <w:bCs/>
-                    <w:color w:val="FFFFFF"/>
-                    <w:sz w:val="15"/>
-                    <w:szCs w:val="15"/>
-                  </w:rPr>
-                  <w:t xml:space="preserve">Section</w:t>
-                </w:r>
-              </w:p>
-            </w:tc>
-          </w:tr>
-          <w:tr>
-            <w:tc>
-              <w:tcPr>
-                <w:tcW w:w="800" w:type="dxa"/>
-                <w:tcBorders>
-                  <w:top w:val="single" w:sz="4" w:space="0" w:color="DDDDDD"/>
-                  <w:left w:val="single" w:sz="4" w:space="0" w:color="DDDDDD"/>
-                  <w:bottom w:val="single" w:sz="4" w:space="0" w:color="DDDDDD"/>
-                  <w:right w:val="single" w:sz="4" w:space="0" w:color="DDDDDD"/>
-                </w:tcBorders>
-                <w:shd w:val="clear" w:color="auto" w:fill="F5F8FF"/>
-                <w:tcMar>
-                  <w:top w:w="80" w:type="dxa"/>
-                  <w:left w:w="120" w:type="dxa"/>
-                  <w:bottom w:w="80" w:type="dxa"/>
-                  <w:right w:w="120" w:type="dxa"/>
-                </w:tcMar>
-              </w:tcPr>
-              <w:p>
-                <w:r>
-                  <w:rPr>
-                    <w:rFonts w:ascii="Wix Madefor Display" w:hAnsi="Wix Madefor Display" w:cs="Wix Madefor Display"/>
-                    <w:color w:val="000000"/>
-                    <w:sz w:val="15"/>
-                    <w:szCs w:val="15"/>
-                  </w:rPr>
-                  <w:t xml:space="preserve">1</w:t>
-                </w:r>
-              </w:p>
-            </w:tc>
-            <w:tc>
-              <w:tcPr>
-                <w:tcW w:w="10000" w:type="dxa"/>
-                <w:tcBorders>
-                  <w:top w:val="single" w:sz="4" w:space="0" w:color="DDDDDD"/>
-                  <w:left w:val="single" w:sz="4" w:space="0" w:color="DDDDDD"/>
-                  <w:bottom w:val="single" w:sz="4" w:space="0" w:color="DDDDDD"/>
-                  <w:right w:val="single" w:sz="4" w:space="0" w:color="DDDDDD"/>
-                </w:tcBorders>
-                <w:shd w:val="clear" w:color="auto" w:fill="F5F8FF"/>
-                <w:tcMar>
-                  <w:top w:w="80" w:type="dxa"/>
-                  <w:left w:w="120" w:type="dxa"/>
-                  <w:bottom w:w="80" w:type="dxa"/>
-                  <w:right w:w="120" w:type="dxa"/>
-                </w:tcMar>
-              </w:tcPr>
-              <w:p>
-                <w:r>
-                  <w:rPr>
-                    <w:rFonts w:ascii="Wix Madefor Display" w:hAnsi="Wix Madefor Display" w:cs="Wix Madefor Display"/>
-                    <w:color w:val="000000"/>
-                    <w:sz w:val="15"/>
-                    <w:szCs w:val="15"/>
-                  </w:rPr>
-                  <w:t xml:space="preserve">How the Skills Fit Together</w:t>
-                </w:r>
-              </w:p>
-            </w:tc>
-          </w:tr>
-          <w:tr>
-            <w:tc>
-              <w:tcPr>
-                <w:tcW w:w="800" w:type="dxa"/>
-                <w:tcBorders>
-                  <w:top w:val="single" w:sz="4" w:space="0" w:color="DDDDDD"/>
-                  <w:left w:val="single" w:sz="4" w:space="0" w:color="DDDDDD"/>
-                  <w:bottom w:val="single" w:sz="4" w:space="0" w:color="DDDDDD"/>
-                  <w:right w:val="single" w:sz="4" w:space="0" w:color="DDDDDD"/>
-                </w:tcBorders>
-                <w:shd w:val="clear" w:color="auto" w:fill="FFFFFF"/>
-                <w:tcMar>
-                  <w:top w:w="80" w:type="dxa"/>
-                  <w:left w:w="120" w:type="dxa"/>
-                  <w:bottom w:w="80" w:type="dxa"/>
-                  <w:right w:w="120" w:type="dxa"/>
-                </w:tcMar>
-              </w:tcPr>
-              <w:p>
-                <w:r>
-                  <w:rPr>
-                    <w:rFonts w:ascii="Wix Madefor Display" w:hAnsi="Wix Madefor Display" w:cs="Wix Madefor Display"/>
-                    <w:color w:val="000000"/>
-                    <w:sz w:val="15"/>
-                    <w:szCs w:val="15"/>
-                  </w:rPr>
-                  <w:t xml:space="preserve">2</w:t>
-                </w:r>
-              </w:p>
-            </w:tc>
-            <w:tc>
-              <w:tcPr>
-                <w:tcW w:w="10000" w:type="dxa"/>
-                <w:tcBorders>
-                  <w:top w:val="single" w:sz="4" w:space="0" w:color="DDDDDD"/>
-                  <w:left w:val="single" w:sz="4" w:space="0" w:color="DDDDDD"/>
-                  <w:bottom w:val="single" w:sz="4" w:space="0" w:color="DDDDDD"/>
-                  <w:right w:val="single" w:sz="4" w:space="0" w:color="DDDDDD"/>
-                </w:tcBorders>
-                <w:shd w:val="clear" w:color="auto" w:fill="FFFFFF"/>
-                <w:tcMar>
-                  <w:top w:w="80" w:type="dxa"/>
-                  <w:left w:w="120" w:type="dxa"/>
-                  <w:bottom w:w="80" w:type="dxa"/>
-                  <w:right w:w="120" w:type="dxa"/>
-                </w:tcMar>
-              </w:tcPr>
-              <w:p>
-                <w:r>
-                  <w:rPr>
-                    <w:rFonts w:ascii="Wix Madefor Display" w:hAnsi="Wix Madefor Display" w:cs="Wix Madefor Display"/>
-                    <w:color w:val="000000"/>
-                    <w:sz w:val="15"/>
-                    <w:szCs w:val="15"/>
-                  </w:rPr>
-                  <w:t xml:space="preserve">Complete Skill Inventory</w:t>
-                </w:r>
-              </w:p>
-            </w:tc>
-          </w:tr>
-          <w:tr>
-            <w:tc>
-              <w:tcPr>
-                <w:tcW w:w="800" w:type="dxa"/>
-                <w:tcBorders>
-                  <w:top w:val="single" w:sz="4" w:space="0" w:color="DDDDDD"/>
-                  <w:left w:val="single" w:sz="4" w:space="0" w:color="DDDDDD"/>
-                  <w:bottom w:val="single" w:sz="4" w:space="0" w:color="DDDDDD"/>
-                  <w:right w:val="single" w:sz="4" w:space="0" w:color="DDDDDD"/>
-                </w:tcBorders>
-                <w:shd w:val="clear" w:color="auto" w:fill="F5F8FF"/>
-                <w:tcMar>
-                  <w:top w:w="80" w:type="dxa"/>
-                  <w:left w:w="120" w:type="dxa"/>
-                  <w:bottom w:w="80" w:type="dxa"/>
-                  <w:right w:w="120" w:type="dxa"/>
-                </w:tcMar>
-              </w:tcPr>
-              <w:p>
-                <w:r>
-                  <w:rPr>
-                    <w:rFonts w:ascii="Wix Madefor Display" w:hAnsi="Wix Madefor Display" w:cs="Wix Madefor Display"/>
-                    <w:color w:val="000000"/>
-                    <w:sz w:val="15"/>
-                    <w:szCs w:val="15"/>
-                  </w:rPr>
-                  <w:t xml:space="preserve">3</w:t>
-                </w:r>
-              </w:p>
-            </w:tc>
-            <w:tc>
-              <w:tcPr>
-                <w:tcW w:w="10000" w:type="dxa"/>
-                <w:tcBorders>
-                  <w:top w:val="single" w:sz="4" w:space="0" w:color="DDDDDD"/>
-                  <w:left w:val="single" w:sz="4" w:space="0" w:color="DDDDDD"/>
-                  <w:bottom w:val="single" w:sz="4" w:space="0" w:color="DDDDDD"/>
-                  <w:right w:val="single" w:sz="4" w:space="0" w:color="DDDDDD"/>
-                </w:tcBorders>
-                <w:shd w:val="clear" w:color="auto" w:fill="F5F8FF"/>
-                <w:tcMar>
-                  <w:top w:w="80" w:type="dxa"/>
-                  <w:left w:w="120" w:type="dxa"/>
-                  <w:bottom w:w="80" w:type="dxa"/>
-                  <w:right w:w="120" w:type="dxa"/>
-                </w:tcMar>
-              </w:tcPr>
-              <w:p>
-                <w:r>
-                  <w:rPr>
-                    <w:rFonts w:ascii="Wix Madefor Display" w:hAnsi="Wix Madefor Display" w:cs="Wix Madefor Display"/>
-                    <w:color w:val="000000"/>
-                    <w:sz w:val="15"/>
-                    <w:szCs w:val="15"/>
-                  </w:rPr>
-                  <w:t xml:space="preserve">Full IC Memo — Sequential Prompts</w:t>
-                </w:r>
-              </w:p>
-            </w:tc>
-          </w:tr>
-          <w:tr>
-            <w:tc>
-              <w:tcPr>
-                <w:tcW w:w="800" w:type="dxa"/>
-                <w:tcBorders>
-                  <w:top w:val="single" w:sz="4" w:space="0" w:color="DDDDDD"/>
-                  <w:left w:val="single" w:sz="4" w:space="0" w:color="DDDDDD"/>
-                  <w:bottom w:val="single" w:sz="4" w:space="0" w:color="DDDDDD"/>
-                  <w:right w:val="single" w:sz="4" w:space="0" w:color="DDDDDD"/>
-                </w:tcBorders>
-                <w:shd w:val="clear" w:color="auto" w:fill="FFFFFF"/>
-                <w:tcMar>
-                  <w:top w:w="80" w:type="dxa"/>
-                  <w:left w:w="120" w:type="dxa"/>
-                  <w:bottom w:w="80" w:type="dxa"/>
-                  <w:right w:w="120" w:type="dxa"/>
-                </w:tcMar>
-              </w:tcPr>
-              <w:p>
-                <w:r>
-                  <w:rPr>
-                    <w:rFonts w:ascii="Wix Madefor Display" w:hAnsi="Wix Madefor Display" w:cs="Wix Madefor Display"/>
-                    <w:color w:val="000000"/>
-                    <w:sz w:val="15"/>
-                    <w:szCs w:val="15"/>
-                  </w:rPr>
-                  <w:t xml:space="preserve">4</w:t>
-                </w:r>
-              </w:p>
-            </w:tc>
-            <w:tc>
-              <w:tcPr>
-                <w:tcW w:w="10000" w:type="dxa"/>
-                <w:tcBorders>
-                  <w:top w:val="single" w:sz="4" w:space="0" w:color="DDDDDD"/>
-                  <w:left w:val="single" w:sz="4" w:space="0" w:color="DDDDDD"/>
-                  <w:bottom w:val="single" w:sz="4" w:space="0" w:color="DDDDDD"/>
-                  <w:right w:val="single" w:sz="4" w:space="0" w:color="DDDDDD"/>
-                </w:tcBorders>
-                <w:shd w:val="clear" w:color="auto" w:fill="FFFFFF"/>
-                <w:tcMar>
-                  <w:top w:w="80" w:type="dxa"/>
-                  <w:left w:w="120" w:type="dxa"/>
-                  <w:bottom w:w="80" w:type="dxa"/>
-                  <w:right w:w="120" w:type="dxa"/>
-                </w:tcMar>
-              </w:tcPr>
-              <w:p>
-                <w:r>
-                  <w:rPr>
-                    <w:rFonts w:ascii="Wix Madefor Display" w:hAnsi="Wix Madefor Display" w:cs="Wix Madefor Display"/>
-                    <w:color w:val="000000"/>
-                    <w:sz w:val="15"/>
-                    <w:szCs w:val="15"/>
-                  </w:rPr>
-                  <w:t xml:space="preserve">Skill Codependencies</w:t>
-                </w:r>
-              </w:p>
-            </w:tc>
-          </w:tr>
-          <w:tr>
-            <w:tc>
-              <w:tcPr>
-                <w:tcW w:w="800" w:type="dxa"/>
-                <w:tcBorders>
-                  <w:top w:val="single" w:sz="4" w:space="0" w:color="DDDDDD"/>
-                  <w:left w:val="single" w:sz="4" w:space="0" w:color="DDDDDD"/>
-                  <w:bottom w:val="single" w:sz="4" w:space="0" w:color="DDDDDD"/>
-                  <w:right w:val="single" w:sz="4" w:space="0" w:color="DDDDDD"/>
-                </w:tcBorders>
-                <w:shd w:val="clear" w:color="auto" w:fill="F5F8FF"/>
-                <w:tcMar>
-                  <w:top w:w="80" w:type="dxa"/>
-                  <w:left w:w="120" w:type="dxa"/>
-                  <w:bottom w:w="80" w:type="dxa"/>
-                  <w:right w:w="120" w:type="dxa"/>
-                </w:tcMar>
-              </w:tcPr>
-              <w:p>
-                <w:r>
-                  <w:rPr>
-                    <w:rFonts w:ascii="Wix Madefor Display" w:hAnsi="Wix Madefor Display" w:cs="Wix Madefor Display"/>
-                    <w:color w:val="000000"/>
-                    <w:sz w:val="15"/>
-                    <w:szCs w:val="15"/>
-                  </w:rPr>
-                  <w:t xml:space="preserve">5</w:t>
-                </w:r>
-              </w:p>
-            </w:tc>
-            <w:tc>
-              <w:tcPr>
-                <w:tcW w:w="10000" w:type="dxa"/>
-                <w:tcBorders>
-                  <w:top w:val="single" w:sz="4" w:space="0" w:color="DDDDDD"/>
-                  <w:left w:val="single" w:sz="4" w:space="0" w:color="DDDDDD"/>
-                  <w:bottom w:val="single" w:sz="4" w:space="0" w:color="DDDDDD"/>
-                  <w:right w:val="single" w:sz="4" w:space="0" w:color="DDDDDD"/>
-                </w:tcBorders>
-                <w:shd w:val="clear" w:color="auto" w:fill="F5F8FF"/>
-                <w:tcMar>
-                  <w:top w:w="80" w:type="dxa"/>
-                  <w:left w:w="120" w:type="dxa"/>
-                  <w:bottom w:w="80" w:type="dxa"/>
-                  <w:right w:w="120" w:type="dxa"/>
-                </w:tcMar>
-              </w:tcPr>
-              <w:p>
-                <w:r>
-                  <w:rPr>
-                    <w:rFonts w:ascii="Wix Madefor Display" w:hAnsi="Wix Madefor Display" w:cs="Wix Madefor Display"/>
-                    <w:color w:val="000000"/>
-                    <w:sz w:val="15"/>
-                    <w:szCs w:val="15"/>
-                  </w:rPr>
-                  <w:t xml:space="preserve">Trigger Phrases</w:t>
-                </w:r>
-              </w:p>
-            </w:tc>
-          </w:tr>
-          <w:tr>
-            <w:tc>
-              <w:tcPr>
-                <w:tcW w:w="800" w:type="dxa"/>
-                <w:tcBorders>
-                  <w:top w:val="single" w:sz="4" w:space="0" w:color="DDDDDD"/>
-                  <w:left w:val="single" w:sz="4" w:space="0" w:color="DDDDDD"/>
-                  <w:bottom w:val="single" w:sz="4" w:space="0" w:color="DDDDDD"/>
-                  <w:right w:val="single" w:sz="4" w:space="0" w:color="DDDDDD"/>
-                </w:tcBorders>
-                <w:shd w:val="clear" w:color="auto" w:fill="FFFFFF"/>
-                <w:tcMar>
-                  <w:top w:w="80" w:type="dxa"/>
-                  <w:left w:w="120" w:type="dxa"/>
-                  <w:bottom w:w="80" w:type="dxa"/>
-                  <w:right w:w="120" w:type="dxa"/>
-                </w:tcMar>
-              </w:tcPr>
-              <w:p>
-                <w:r>
-                  <w:rPr>
-                    <w:rFonts w:ascii="Wix Madefor Display" w:hAnsi="Wix Madefor Display" w:cs="Wix Madefor Display"/>
-                    <w:color w:val="000000"/>
-                    <w:sz w:val="15"/>
-                    <w:szCs w:val="15"/>
-                  </w:rPr>
-                  <w:t xml:space="preserve">6</w:t>
-                </w:r>
-              </w:p>
-            </w:tc>
-            <w:tc>
-              <w:tcPr>
-                <w:tcW w:w="10000" w:type="dxa"/>
-                <w:tcBorders>
-                  <w:top w:val="single" w:sz="4" w:space="0" w:color="DDDDDD"/>
-                  <w:left w:val="single" w:sz="4" w:space="0" w:color="DDDDDD"/>
-                  <w:bottom w:val="single" w:sz="4" w:space="0" w:color="DDDDDD"/>
-                  <w:right w:val="single" w:sz="4" w:space="0" w:color="DDDDDD"/>
-                </w:tcBorders>
-                <w:shd w:val="clear" w:color="auto" w:fill="FFFFFF"/>
-                <w:tcMar>
-                  <w:top w:w="80" w:type="dxa"/>
-                  <w:left w:w="120" w:type="dxa"/>
-                  <w:bottom w:w="80" w:type="dxa"/>
-                  <w:right w:w="120" w:type="dxa"/>
-                </w:tcMar>
-              </w:tcPr>
-              <w:p>
-                <w:r>
-                  <w:rPr>
-                    <w:rFonts w:ascii="Wix Madefor Display" w:hAnsi="Wix Madefor Display" w:cs="Wix Madefor Display"/>
-                    <w:color w:val="000000"/>
-                    <w:sz w:val="15"/>
-                    <w:szCs w:val="15"/>
-                  </w:rPr>
-                  <w:t xml:space="preserve">Input Requirements</w:t>
-                </w:r>
-              </w:p>
-            </w:tc>
-          </w:tr>
-          <w:tr>
-            <w:tc>
-              <w:tcPr>
-                <w:tcW w:w="800" w:type="dxa"/>
-                <w:tcBorders>
-                  <w:top w:val="single" w:sz="4" w:space="0" w:color="DDDDDD"/>
-                  <w:left w:val="single" w:sz="4" w:space="0" w:color="DDDDDD"/>
-                  <w:bottom w:val="single" w:sz="4" w:space="0" w:color="DDDDDD"/>
-                  <w:right w:val="single" w:sz="4" w:space="0" w:color="DDDDDD"/>
-                </w:tcBorders>
-                <w:shd w:val="clear" w:color="auto" w:fill="F5F8FF"/>
-                <w:tcMar>
-                  <w:top w:w="80" w:type="dxa"/>
-                  <w:left w:w="120" w:type="dxa"/>
-                  <w:bottom w:w="80" w:type="dxa"/>
-                  <w:right w:w="120" w:type="dxa"/>
-                </w:tcMar>
-              </w:tcPr>
-              <w:p>
-                <w:r>
-                  <w:rPr>
-                    <w:rFonts w:ascii="Wix Madefor Display" w:hAnsi="Wix Madefor Display" w:cs="Wix Madefor Display"/>
-                    <w:color w:val="000000"/>
-                    <w:sz w:val="15"/>
-                    <w:szCs w:val="15"/>
-                  </w:rPr>
-                  <w:t xml:space="preserve">7</w:t>
-                </w:r>
-              </w:p>
-            </w:tc>
-            <w:tc>
-              <w:tcPr>
-                <w:tcW w:w="10000" w:type="dxa"/>
-                <w:tcBorders>
-                  <w:top w:val="single" w:sz="4" w:space="0" w:color="DDDDDD"/>
-                  <w:left w:val="single" w:sz="4" w:space="0" w:color="DDDDDD"/>
-                  <w:bottom w:val="single" w:sz="4" w:space="0" w:color="DDDDDD"/>
-                  <w:right w:val="single" w:sz="4" w:space="0" w:color="DDDDDD"/>
-                </w:tcBorders>
-                <w:shd w:val="clear" w:color="auto" w:fill="F5F8FF"/>
-                <w:tcMar>
-                  <w:top w:w="80" w:type="dxa"/>
-                  <w:left w:w="120" w:type="dxa"/>
-                  <w:bottom w:w="80" w:type="dxa"/>
-                  <w:right w:w="120" w:type="dxa"/>
-                </w:tcMar>
-              </w:tcPr>
-              <w:p>
-                <w:r>
-                  <w:rPr>
-                    <w:rFonts w:ascii="Wix Madefor Display" w:hAnsi="Wix Madefor Display" w:cs="Wix Madefor Display"/>
-                    <w:color w:val="000000"/>
-                    <w:sz w:val="15"/>
-                    <w:szCs w:val="15"/>
-                  </w:rPr>
-                  <w:t xml:space="preserve">Workflow Chains</w:t>
-                </w:r>
-              </w:p>
-            </w:tc>
-          </w:tr>
-          <w:tr>
-            <w:tc>
-              <w:tcPr>
-                <w:tcW w:w="800" w:type="dxa"/>
-                <w:tcBorders>
-                  <w:top w:val="single" w:sz="4" w:space="0" w:color="DDDDDD"/>
-                  <w:left w:val="single" w:sz="4" w:space="0" w:color="DDDDDD"/>
-                  <w:bottom w:val="single" w:sz="4" w:space="0" w:color="DDDDDD"/>
-                  <w:right w:val="single" w:sz="4" w:space="0" w:color="DDDDDD"/>
-                </w:tcBorders>
-                <w:shd w:val="clear" w:color="auto" w:fill="FFFFFF"/>
-                <w:tcMar>
-                  <w:top w:w="80" w:type="dxa"/>
-                  <w:left w:w="120" w:type="dxa"/>
-                  <w:bottom w:w="80" w:type="dxa"/>
-                  <w:right w:w="120" w:type="dxa"/>
-                </w:tcMar>
-              </w:tcPr>
-              <w:p>
-                <w:r>
-                  <w:rPr>
-                    <w:rFonts w:ascii="Wix Madefor Display" w:hAnsi="Wix Madefor Display" w:cs="Wix Madefor Display"/>
-                    <w:color w:val="000000"/>
-                    <w:sz w:val="15"/>
-                    <w:szCs w:val="15"/>
-                  </w:rPr>
-                  <w:t xml:space="preserve">8</w:t>
-                </w:r>
-              </w:p>
-            </w:tc>
-            <w:tc>
-              <w:tcPr>
-                <w:tcW w:w="10000" w:type="dxa"/>
-                <w:tcBorders>
-                  <w:top w:val="single" w:sz="4" w:space="0" w:color="DDDDDD"/>
-                  <w:left w:val="single" w:sz="4" w:space="0" w:color="DDDDDD"/>
-                  <w:bottom w:val="single" w:sz="4" w:space="0" w:color="DDDDDD"/>
-                  <w:right w:val="single" w:sz="4" w:space="0" w:color="DDDDDD"/>
-                </w:tcBorders>
-                <w:shd w:val="clear" w:color="auto" w:fill="FFFFFF"/>
-                <w:tcMar>
-                  <w:top w:w="80" w:type="dxa"/>
-                  <w:left w:w="120" w:type="dxa"/>
-                  <w:bottom w:w="80" w:type="dxa"/>
-                  <w:right w:w="120" w:type="dxa"/>
-                </w:tcMar>
-              </w:tcPr>
-              <w:p>
-                <w:r>
-                  <w:rPr>
-                    <w:rFonts w:ascii="Wix Madefor Display" w:hAnsi="Wix Madefor Display" w:cs="Wix Madefor Display"/>
-                    <w:color w:val="000000"/>
-                    <w:sz w:val="15"/>
-                    <w:szCs w:val="15"/>
-                  </w:rPr>
-                  <w:t xml:space="preserve">Reference Files</w:t>
-                </w:r>
-              </w:p>
-            </w:tc>
-          </w:tr>
-          <w:tr>
-            <w:tc>
-              <w:tcPr>
-                <w:tcW w:w="800" w:type="dxa"/>
-                <w:tcBorders>
-                  <w:top w:val="single" w:sz="4" w:space="0" w:color="DDDDDD"/>
-                  <w:left w:val="single" w:sz="4" w:space="0" w:color="DDDDDD"/>
-                  <w:bottom w:val="single" w:sz="4" w:space="0" w:color="DDDDDD"/>
-                  <w:right w:val="single" w:sz="4" w:space="0" w:color="DDDDDD"/>
-                </w:tcBorders>
-                <w:shd w:val="clear" w:color="auto" w:fill="F5F8FF"/>
-                <w:tcMar>
-                  <w:top w:w="80" w:type="dxa"/>
-                  <w:left w:w="120" w:type="dxa"/>
-                  <w:bottom w:w="80" w:type="dxa"/>
-                  <w:right w:w="120" w:type="dxa"/>
-                </w:tcMar>
-              </w:tcPr>
-              <w:p>
-                <w:r>
-                  <w:rPr>
-                    <w:rFonts w:ascii="Wix Madefor Display" w:hAnsi="Wix Madefor Display" w:cs="Wix Madefor Display"/>
-                    <w:color w:val="000000"/>
-                    <w:sz w:val="15"/>
-                    <w:szCs w:val="15"/>
-                  </w:rPr>
-                  <w:t xml:space="preserve">9</w:t>
-                </w:r>
-              </w:p>
-            </w:tc>
-            <w:tc>
-              <w:tcPr>
-                <w:tcW w:w="10000" w:type="dxa"/>
-                <w:tcBorders>
-                  <w:top w:val="single" w:sz="4" w:space="0" w:color="DDDDDD"/>
-                  <w:left w:val="single" w:sz="4" w:space="0" w:color="DDDDDD"/>
-                  <w:bottom w:val="single" w:sz="4" w:space="0" w:color="DDDDDD"/>
-                  <w:right w:val="single" w:sz="4" w:space="0" w:color="DDDDDD"/>
-                </w:tcBorders>
-                <w:shd w:val="clear" w:color="auto" w:fill="F5F8FF"/>
-                <w:tcMar>
-                  <w:top w:w="80" w:type="dxa"/>
-                  <w:left w:w="120" w:type="dxa"/>
-                  <w:bottom w:w="80" w:type="dxa"/>
-                  <w:right w:w="120" w:type="dxa"/>
-                </w:tcMar>
-              </w:tcPr>
-              <w:p>
-                <w:r>
-                  <w:rPr>
-                    <w:rFonts w:ascii="Wix Madefor Display" w:hAnsi="Wix Madefor Display" w:cs="Wix Madefor Display"/>
-                    <w:color w:val="000000"/>
-                    <w:sz w:val="15"/>
-                    <w:szCs w:val="15"/>
-                  </w:rPr>
-                  <w:t xml:space="preserve">Skills Directory</w:t>
-                </w:r>
-              </w:p>
-            </w:tc>
-          </w:tr>
-          <w:tr>
-            <w:tc>
-              <w:tcPr>
-                <w:tcW w:w="800" w:type="dxa"/>
-                <w:tcBorders>
-                  <w:top w:val="single" w:sz="4" w:space="0" w:color="DDDDDD"/>
-                  <w:left w:val="single" w:sz="4" w:space="0" w:color="DDDDDD"/>
-                  <w:bottom w:val="single" w:sz="4" w:space="0" w:color="DDDDDD"/>
-                  <w:right w:val="single" w:sz="4" w:space="0" w:color="DDDDDD"/>
-                </w:tcBorders>
-                <w:shd w:val="clear" w:color="auto" w:fill="FFFFFF"/>
-                <w:tcMar>
-                  <w:top w:w="80" w:type="dxa"/>
-                  <w:left w:w="120" w:type="dxa"/>
-                  <w:bottom w:w="80" w:type="dxa"/>
-                  <w:right w:w="120" w:type="dxa"/>
-                </w:tcMar>
-              </w:tcPr>
-              <w:p>
-                <w:r>
-                  <w:rPr>
-                    <w:rFonts w:ascii="Wix Madefor Display" w:hAnsi="Wix Madefor Display" w:cs="Wix Madefor Display"/>
-                    <w:color w:val="000000"/>
-                    <w:sz w:val="15"/>
-                    <w:szCs w:val="15"/>
-                  </w:rPr>
-                  <w:t xml:space="preserve">10</w:t>
-                </w:r>
-              </w:p>
-            </w:tc>
-            <w:tc>
-              <w:tcPr>
-                <w:tcW w:w="10000" w:type="dxa"/>
-                <w:tcBorders>
-                  <w:top w:val="single" w:sz="4" w:space="0" w:color="DDDDDD"/>
-                  <w:left w:val="single" w:sz="4" w:space="0" w:color="DDDDDD"/>
-                  <w:bottom w:val="single" w:sz="4" w:space="0" w:color="DDDDDD"/>
-                  <w:right w:val="single" w:sz="4" w:space="0" w:color="DDDDDD"/>
-                </w:tcBorders>
-                <w:shd w:val="clear" w:color="auto" w:fill="FFFFFF"/>
-                <w:tcMar>
-                  <w:top w:w="80" w:type="dxa"/>
-                  <w:left w:w="120" w:type="dxa"/>
-                  <w:bottom w:w="80" w:type="dxa"/>
-                  <w:right w:w="120" w:type="dxa"/>
-                </w:tcMar>
-              </w:tcPr>
-              <w:p>
-                <w:r>
-                  <w:rPr>
-                    <w:rFonts w:ascii="Wix Madefor Display" w:hAnsi="Wix Madefor Display" w:cs="Wix Madefor Display"/>
-                    <w:color w:val="000000"/>
-                    <w:sz w:val="15"/>
-                    <w:szCs w:val="15"/>
-                  </w:rPr>
-                  <w:t xml:space="preserve">Plugins (PE/M&amp;A Workflow)</w:t>
-                </w:r>
-              </w:p>
-            </w:tc>
-          </w:tr>
-        </w:tbl>
-        <w:p>
-          <w:pPr>
-            <w:spacing w:after="80"/>
-          </w:pPr>
-        </w:p>
+        <w:spacing w:before="200" w:after="80"/>
+      </w:pPr>
+      <w:r>
+        <w:rPr>
+          <w:rFonts w:ascii="Wix Madefor Display SemiBold" w:hAnsi="Wix Madefor Display SemiBold" w:cs="Wix Madefor Display SemiBold"/>
+          <w:b/>
+          <w:bCs/>
+          <w:color w:val="4280F4"/>
+          <w:sz w:val="18"/>
+          <w:szCs w:val="18"/>
+        </w:rPr>
+        <w:t>Contents</w:t>
+      </w:r>
+    </w:p>
+    <w:tbl>
+      <w:tblPr>
+        <w:tblW w:w="10800" w:type="dxa"/>
+        <w:tblBorders>
+          <w:top w:val="single" w:sz="4" w:space="0" w:color="DDDDDD"/>
+          <w:left w:val="single" w:sz="4" w:space="0" w:color="DDDDDD"/>
+          <w:bottom w:val="single" w:sz="4" w:space="0" w:color="DDDDDD"/>
+          <w:right w:val="single" w:sz="4" w:space="0" w:color="DDDDDD"/>
+          <w:insideH w:val="single" w:sz="4" w:space="0" w:color="DDDDDD"/>
+          <w:insideV w:val="single" w:sz="4" w:space="0" w:color="DDDDDD"/>
+        </w:tblBorders>
+        <w:tblCellMar>
+          <w:top w:w="80" w:type="dxa"/>
+          <w:left w:w="120" w:type="dxa"/>
+          <w:bottom w:w="80" w:type="dxa"/>
+          <w:right w:w="120" w:type="dxa"/>
+        </w:tblCellMar>
+      </w:tblPr>
+      <w:tblGrid>
+        <w:gridCol w:w="800"/>
+        <w:gridCol w:w="10000"/>
+      </w:tblGrid>
+      <w:tr>
+        <w:tc>
+          <w:tcPr>
+            <w:tcW w:w="800" w:type="dxa"/>
+            <w:tcBorders>
+              <w:top w:val="single" w:sz="4" w:space="0" w:color="DDDDDD"/>
+              <w:left w:val="single" w:sz="4" w:space="0" w:color="DDDDDD"/>
+              <w:bottom w:val="single" w:sz="4" w:space="0" w:color="DDDDDD"/>
+              <w:right w:val="single" w:sz="4" w:space="0" w:color="DDDDDD"/>
+            </w:tcBorders>
+            <w:shd w:val="clear" w:color="auto" w:fill="0F4761"/>
+            <w:tcMar>
+              <w:top w:w="80" w:type="dxa"/>
+              <w:left w:w="120" w:type="dxa"/>
+              <w:bottom w:w="80" w:type="dxa"/>
+              <w:right w:w="120" w:type="dxa"/>
+            </w:tcMar>
+          </w:tcPr>
+          <w:p>
+            <w:r>
+              <w:rPr>
+                <w:rFonts w:ascii="Wix Madefor Display SemiBold" w:hAnsi="Wix Madefor Display SemiBold" w:cs="Wix Madefor Display SemiBold"/>
+                <w:b/>
+                <w:bCs/>
+                <w:color w:val="FFFFFF"/>
+                <w:sz w:val="15"/>
+                <w:szCs w:val="15"/>
+              </w:rPr>
+              <w:t xml:space="preserve">#</w:t>
+            </w:r>
+          </w:p>
+        </w:tc>
+        <w:tc>
+          <w:tcPr>
+            <w:tcW w:w="10000" w:type="dxa"/>
+            <w:tcBorders>
+              <w:top w:val="single" w:sz="4" w:space="0" w:color="DDDDDD"/>
+              <w:left w:val="single" w:sz="4" w:space="0" w:color="DDDDDD"/>
+              <w:bottom w:val="single" w:sz="4" w:space="0" w:color="DDDDDD"/>
+              <w:right w:val="single" w:sz="4" w:space="0" w:color="DDDDDD"/>
+            </w:tcBorders>
+            <w:shd w:val="clear" w:color="auto" w:fill="0F4761"/>
+            <w:tcMar>
+              <w:top w:w="80" w:type="dxa"/>
+              <w:left w:w="120" w:type="dxa"/>
+              <w:bottom w:w="80" w:type="dxa"/>
+              <w:right w:w="120" w:type="dxa"/>
+            </w:tcMar>
+          </w:tcPr>
+          <w:p>
+            <w:r>
+              <w:rPr>
+                <w:rFonts w:ascii="Wix Madefor Display SemiBold" w:hAnsi="Wix Madefor Display SemiBold" w:cs="Wix Madefor Display SemiBold"/>
+                <w:b/>
+                <w:bCs/>
+                <w:color w:val="FFFFFF"/>
+                <w:sz w:val="15"/>
+                <w:szCs w:val="15"/>
+              </w:rPr>
+              <w:t xml:space="preserve">Section</w:t>
+            </w:r>
+          </w:p>
+        </w:tc>
+      </w:tr>
+      <w:tr>
+        <w:tc>
+          <w:tcPr>
+            <w:tcW w:w="800" w:type="dxa"/>
+            <w:tcBorders>
+              <w:top w:val="single" w:sz="4" w:space="0" w:color="DDDDDD"/>
+              <w:left w:val="single" w:sz="4" w:space="0" w:color="DDDDDD"/>
+              <w:bottom w:val="single" w:sz="4" w:space="0" w:color="DDDDDD"/>
+              <w:right w:val="single" w:sz="4" w:space="0" w:color="DDDDDD"/>
+            </w:tcBorders>
+            <w:shd w:val="clear" w:color="auto" w:fill="F5F8FF"/>
+            <w:tcMar>
+              <w:top w:w="80" w:type="dxa"/>
+              <w:left w:w="120" w:type="dxa"/>
+              <w:bottom w:w="80" w:type="dxa"/>
+              <w:right w:w="120" w:type="dxa"/>
+            </w:tcMar>
+          </w:tcPr>
+          <w:p>
+            <w:r>
+              <w:rPr>
+                <w:rFonts w:ascii="Wix Madefor Display" w:hAnsi="Wix Madefor Display" w:cs="Wix Madefor Display"/>
+                <w:color w:val="000000"/>
+                <w:sz w:val="15"/>
+                <w:szCs w:val="15"/>
+              </w:rPr>
+              <w:t xml:space="preserve">1</w:t>
+            </w:r>
+          </w:p>
+        </w:tc>
+        <w:tc>
+          <w:tcPr>
+            <w:tcW w:w="10000" w:type="dxa"/>
+            <w:tcBorders>
+              <w:top w:val="single" w:sz="4" w:space="0" w:color="DDDDDD"/>
+              <w:left w:val="single" w:sz="4" w:space="0" w:color="DDDDDD"/>
+              <w:bottom w:val="single" w:sz="4" w:space="0" w:color="DDDDDD"/>
+              <w:right w:val="single" w:sz="4" w:space="0" w:color="DDDDDD"/>
+            </w:tcBorders>
+            <w:shd w:val="clear" w:color="auto" w:fill="F5F8FF"/>
+            <w:tcMar>
+              <w:top w:w="80" w:type="dxa"/>
+              <w:left w:w="120" w:type="dxa"/>
+              <w:bottom w:w="80" w:type="dxa"/>
+              <w:right w:w="120" w:type="dxa"/>
+            </w:tcMar>
+          </w:tcPr>
+          <w:p>
+            <w:r>
+              <w:rPr>
+                <w:rFonts w:ascii="Wix Madefor Display" w:hAnsi="Wix Madefor Display" w:cs="Wix Madefor Display"/>
+                <w:color w:val="000000"/>
+                <w:sz w:val="15"/>
+                <w:szCs w:val="15"/>
+              </w:rPr>
+              <w:t xml:space="preserve">How the Skills Fit Together</w:t>
+            </w:r>
+          </w:p>
+        </w:tc>
+      </w:tr>
+      <w:tr>
+        <w:tc>
+          <w:tcPr>
+            <w:tcW w:w="800" w:type="dxa"/>
+            <w:tcBorders>
+              <w:top w:val="single" w:sz="4" w:space="0" w:color="DDDDDD"/>
+              <w:left w:val="single" w:sz="4" w:space="0" w:color="DDDDDD"/>
+              <w:bottom w:val="single" w:sz="4" w:space="0" w:color="DDDDDD"/>
+              <w:right w:val="single" w:sz="4" w:space="0" w:color="DDDDDD"/>
+            </w:tcBorders>
+            <w:shd w:val="clear" w:color="auto" w:fill="FFFFFF"/>
+            <w:tcMar>
+              <w:top w:w="80" w:type="dxa"/>
+              <w:left w:w="120" w:type="dxa"/>
+              <w:bottom w:w="80" w:type="dxa"/>
+              <w:right w:w="120" w:type="dxa"/>
+            </w:tcMar>
+          </w:tcPr>
+          <w:p>
+            <w:r>
+              <w:rPr>
+                <w:rFonts w:ascii="Wix Madefor Display" w:hAnsi="Wix Madefor Display" w:cs="Wix Madefor Display"/>
+                <w:color w:val="000000"/>
+                <w:sz w:val="15"/>
+                <w:szCs w:val="15"/>
+              </w:rPr>
+              <w:t xml:space="preserve">2</w:t>
+            </w:r>
+          </w:p>
+        </w:tc>
+        <w:tc>
+          <w:tcPr>
+            <w:tcW w:w="10000" w:type="dxa"/>
+            <w:tcBorders>
+              <w:top w:val="single" w:sz="4" w:space="0" w:color="DDDDDD"/>
+              <w:left w:val="single" w:sz="4" w:space="0" w:color="DDDDDD"/>
+              <w:bottom w:val="single" w:sz="4" w:space="0" w:color="DDDDDD"/>
+              <w:right w:val="single" w:sz="4" w:space="0" w:color="DDDDDD"/>
+            </w:tcBorders>
+            <w:shd w:val="clear" w:color="auto" w:fill="FFFFFF"/>
+            <w:tcMar>
+              <w:top w:w="80" w:type="dxa"/>
+              <w:left w:w="120" w:type="dxa"/>
+              <w:bottom w:w="80" w:type="dxa"/>
+              <w:right w:w="120" w:type="dxa"/>
+            </w:tcMar>
+          </w:tcPr>
+          <w:p>
+            <w:r>
+              <w:rPr>
+                <w:rFonts w:ascii="Wix Madefor Display" w:hAnsi="Wix Madefor Display" w:cs="Wix Madefor Display"/>
+                <w:color w:val="000000"/>
+                <w:sz w:val="15"/>
+                <w:szCs w:val="15"/>
+              </w:rPr>
+              <w:t xml:space="preserve">Complete Skill Inventory</w:t>
+            </w:r>
+          </w:p>
+        </w:tc>
+      </w:tr>
+      <w:tr>
+        <w:tc>
+          <w:tcPr>
+            <w:tcW w:w="800" w:type="dxa"/>
+            <w:tcBorders>
+              <w:top w:val="single" w:sz="4" w:space="0" w:color="DDDDDD"/>
+              <w:left w:val="single" w:sz="4" w:space="0" w:color="DDDDDD"/>
+              <w:bottom w:val="single" w:sz="4" w:space="0" w:color="DDDDDD"/>
+              <w:right w:val="single" w:sz="4" w:space="0" w:color="DDDDDD"/>
+            </w:tcBorders>
+            <w:shd w:val="clear" w:color="auto" w:fill="F5F8FF"/>
+            <w:tcMar>
+              <w:top w:w="80" w:type="dxa"/>
+              <w:left w:w="120" w:type="dxa"/>
+              <w:bottom w:w="80" w:type="dxa"/>
+              <w:right w:w="120" w:type="dxa"/>
+            </w:tcMar>
+          </w:tcPr>
+          <w:p>
+            <w:r>
+              <w:rPr>
+                <w:rFonts w:ascii="Wix Madefor Display" w:hAnsi="Wix Madefor Display" w:cs="Wix Madefor Display"/>
+                <w:color w:val="000000"/>
+                <w:sz w:val="15"/>
+                <w:szCs w:val="15"/>
+              </w:rPr>
+              <w:t xml:space="preserve">3</w:t>
+            </w:r>
+          </w:p>
+        </w:tc>
+        <w:tc>
+          <w:tcPr>
+            <w:tcW w:w="10000" w:type="dxa"/>
+            <w:tcBorders>
+              <w:top w:val="single" w:sz="4" w:space="0" w:color="DDDDDD"/>
+              <w:left w:val="single" w:sz="4" w:space="0" w:color="DDDDDD"/>
+              <w:bottom w:val="single" w:sz="4" w:space="0" w:color="DDDDDD"/>
+              <w:right w:val="single" w:sz="4" w:space="0" w:color="DDDDDD"/>
+            </w:tcBorders>
+            <w:shd w:val="clear" w:color="auto" w:fill="F5F8FF"/>
+            <w:tcMar>
+              <w:top w:w="80" w:type="dxa"/>
+              <w:left w:w="120" w:type="dxa"/>
+              <w:bottom w:w="80" w:type="dxa"/>
+              <w:right w:w="120" w:type="dxa"/>
+            </w:tcMar>
+          </w:tcPr>
+          <w:p>
+            <w:r>
+              <w:rPr>
+                <w:rFonts w:ascii="Wix Madefor Display" w:hAnsi="Wix Madefor Display" w:cs="Wix Madefor Display"/>
+                <w:color w:val="000000"/>
+                <w:sz w:val="15"/>
+                <w:szCs w:val="15"/>
+              </w:rPr>
+              <w:t xml:space="preserve">Full IC Memo — Sequential Prompts</w:t>
+            </w:r>
+          </w:p>
+        </w:tc>
+      </w:tr>
+      <w:tr>
+        <w:tc>
+          <w:tcPr>
+            <w:tcW w:w="800" w:type="dxa"/>
+            <w:tcBorders>
+              <w:top w:val="single" w:sz="4" w:space="0" w:color="DDDDDD"/>
+              <w:left w:val="single" w:sz="4" w:space="0" w:color="DDDDDD"/>
+              <w:bottom w:val="single" w:sz="4" w:space="0" w:color="DDDDDD"/>
+              <w:right w:val="single" w:sz="4" w:space="0" w:color="DDDDDD"/>
+            </w:tcBorders>
+            <w:shd w:val="clear" w:color="auto" w:fill="FFFFFF"/>
+            <w:tcMar>
+              <w:top w:w="80" w:type="dxa"/>
+              <w:left w:w="120" w:type="dxa"/>
+              <w:bottom w:w="80" w:type="dxa"/>
+              <w:right w:w="120" w:type="dxa"/>
+            </w:tcMar>
+          </w:tcPr>
+          <w:p>
+            <w:r>
+              <w:rPr>
+                <w:rFonts w:ascii="Wix Madefor Display" w:hAnsi="Wix Madefor Display" w:cs="Wix Madefor Display"/>
+                <w:color w:val="000000"/>
+                <w:sz w:val="15"/>
+                <w:szCs w:val="15"/>
+              </w:rPr>
+              <w:t xml:space="preserve">4</w:t>
+            </w:r>
+          </w:p>
+        </w:tc>
+        <w:tc>
+          <w:tcPr>
+            <w:tcW w:w="10000" w:type="dxa"/>
+            <w:tcBorders>
+              <w:top w:val="single" w:sz="4" w:space="0" w:color="DDDDDD"/>
+              <w:left w:val="single" w:sz="4" w:space="0" w:color="DDDDDD"/>
+              <w:bottom w:val="single" w:sz="4" w:space="0" w:color="DDDDDD"/>
+              <w:right w:val="single" w:sz="4" w:space="0" w:color="DDDDDD"/>
+            </w:tcBorders>
+            <w:shd w:val="clear" w:color="auto" w:fill="FFFFFF"/>
+            <w:tcMar>
+              <w:top w:w="80" w:type="dxa"/>
+              <w:left w:w="120" w:type="dxa"/>
+              <w:bottom w:w="80" w:type="dxa"/>
+              <w:right w:w="120" w:type="dxa"/>
+            </w:tcMar>
+          </w:tcPr>
+          <w:p>
+            <w:r>
+              <w:rPr>
+                <w:rFonts w:ascii="Wix Madefor Display" w:hAnsi="Wix Madefor Display" w:cs="Wix Madefor Display"/>
+                <w:color w:val="000000"/>
+                <w:sz w:val="15"/>
+                <w:szCs w:val="15"/>
+              </w:rPr>
+              <w:t xml:space="preserve">Skill Codependencies</w:t>
+            </w:r>
+          </w:p>
+        </w:tc>
+      </w:tr>
+      <w:tr>
+        <w:tc>
+          <w:tcPr>
+            <w:tcW w:w="800" w:type="dxa"/>
+            <w:tcBorders>
+              <w:top w:val="single" w:sz="4" w:space="0" w:color="DDDDDD"/>
+              <w:left w:val="single" w:sz="4" w:space="0" w:color="DDDDDD"/>
+              <w:bottom w:val="single" w:sz="4" w:space="0" w:color="DDDDDD"/>
+              <w:right w:val="single" w:sz="4" w:space="0" w:color="DDDDDD"/>
+            </w:tcBorders>
+            <w:shd w:val="clear" w:color="auto" w:fill="F5F8FF"/>
+            <w:tcMar>
+              <w:top w:w="80" w:type="dxa"/>
+              <w:left w:w="120" w:type="dxa"/>
+              <w:bottom w:w="80" w:type="dxa"/>
+              <w:right w:w="120" w:type="dxa"/>
+            </w:tcMar>
+          </w:tcPr>
+          <w:p>
+            <w:r>
+              <w:rPr>
+                <w:rFonts w:ascii="Wix Madefor Display" w:hAnsi="Wix Madefor Display" w:cs="Wix Madefor Display"/>
+                <w:color w:val="000000"/>
+                <w:sz w:val="15"/>
+                <w:szCs w:val="15"/>
+              </w:rPr>
+              <w:t xml:space="preserve">5</w:t>
+            </w:r>
+          </w:p>
+        </w:tc>
+        <w:tc>
+          <w:tcPr>
+            <w:tcW w:w="10000" w:type="dxa"/>
+            <w:tcBorders>
+              <w:top w:val="single" w:sz="4" w:space="0" w:color="DDDDDD"/>
+              <w:left w:val="single" w:sz="4" w:space="0" w:color="DDDDDD"/>
+              <w:bottom w:val="single" w:sz="4" w:space="0" w:color="DDDDDD"/>
+              <w:right w:val="single" w:sz="4" w:space="0" w:color="DDDDDD"/>
+            </w:tcBorders>
+            <w:shd w:val="clear" w:color="auto" w:fill="F5F8FF"/>
+            <w:tcMar>
+              <w:top w:w="80" w:type="dxa"/>
+              <w:left w:w="120" w:type="dxa"/>
+              <w:bottom w:w="80" w:type="dxa"/>
+              <w:right w:w="120" w:type="dxa"/>
+            </w:tcMar>
+          </w:tcPr>
+          <w:p>
+            <w:r>
+              <w:rPr>
+                <w:rFonts w:ascii="Wix Madefor Display" w:hAnsi="Wix Madefor Display" w:cs="Wix Madefor Display"/>
+                <w:color w:val="000000"/>
+                <w:sz w:val="15"/>
+                <w:szCs w:val="15"/>
+              </w:rPr>
+              <w:t xml:space="preserve">Trigger Phrases</w:t>
+            </w:r>
+          </w:p>
+        </w:tc>
+      </w:tr>
+      <w:tr>
+        <w:tc>
+          <w:tcPr>
+            <w:tcW w:w="800" w:type="dxa"/>
+            <w:tcBorders>
+              <w:top w:val="single" w:sz="4" w:space="0" w:color="DDDDDD"/>
+              <w:left w:val="single" w:sz="4" w:space="0" w:color="DDDDDD"/>
+              <w:bottom w:val="single" w:sz="4" w:space="0" w:color="DDDDDD"/>
+              <w:right w:val="single" w:sz="4" w:space="0" w:color="DDDDDD"/>
+            </w:tcBorders>
+            <w:shd w:val="clear" w:color="auto" w:fill="FFFFFF"/>
+            <w:tcMar>
+              <w:top w:w="80" w:type="dxa"/>
+              <w:left w:w="120" w:type="dxa"/>
+              <w:bottom w:w="80" w:type="dxa"/>
+              <w:right w:w="120" w:type="dxa"/>
+            </w:tcMar>
+          </w:tcPr>
+          <w:p>
+            <w:r>
+              <w:rPr>
+                <w:rFonts w:ascii="Wix Madefor Display" w:hAnsi="Wix Madefor Display" w:cs="Wix Madefor Display"/>
+                <w:color w:val="000000"/>
+                <w:sz w:val="15"/>
+                <w:szCs w:val="15"/>
+              </w:rPr>
+              <w:t xml:space="preserve">6</w:t>
+            </w:r>
+          </w:p>
+        </w:tc>
+        <w:tc>
+          <w:tcPr>
+            <w:tcW w:w="10000" w:type="dxa"/>
+            <w:tcBorders>
+              <w:top w:val="single" w:sz="4" w:space="0" w:color="DDDDDD"/>
+              <w:left w:val="single" w:sz="4" w:space="0" w:color="DDDDDD"/>
+              <w:bottom w:val="single" w:sz="4" w:space="0" w:color="DDDDDD"/>
+              <w:right w:val="single" w:sz="4" w:space="0" w:color="DDDDDD"/>
+            </w:tcBorders>
+            <w:shd w:val="clear" w:color="auto" w:fill="FFFFFF"/>
+            <w:tcMar>
+              <w:top w:w="80" w:type="dxa"/>
+              <w:left w:w="120" w:type="dxa"/>
+              <w:bottom w:w="80" w:type="dxa"/>
+              <w:right w:w="120" w:type="dxa"/>
+            </w:tcMar>
+          </w:tcPr>
+          <w:p>
+            <w:r>
+              <w:rPr>
+                <w:rFonts w:ascii="Wix Madefor Display" w:hAnsi="Wix Madefor Display" w:cs="Wix Madefor Display"/>
+                <w:color w:val="000000"/>
+                <w:sz w:val="15"/>
+                <w:szCs w:val="15"/>
+              </w:rPr>
+              <w:t xml:space="preserve">Input Requirements</w:t>
+            </w:r>
+          </w:p>
+        </w:tc>
+      </w:tr>
+      <w:tr>
+        <w:tc>
+          <w:tcPr>
+            <w:tcW w:w="800" w:type="dxa"/>
+            <w:tcBorders>
+              <w:top w:val="single" w:sz="4" w:space="0" w:color="DDDDDD"/>
+              <w:left w:val="single" w:sz="4" w:space="0" w:color="DDDDDD"/>
+              <w:bottom w:val="single" w:sz="4" w:space="0" w:color="DDDDDD"/>
+              <w:right w:val="single" w:sz="4" w:space="0" w:color="DDDDDD"/>
+            </w:tcBorders>
+            <w:shd w:val="clear" w:color="auto" w:fill="F5F8FF"/>
+            <w:tcMar>
+              <w:top w:w="80" w:type="dxa"/>
+              <w:left w:w="120" w:type="dxa"/>
+              <w:bottom w:w="80" w:type="dxa"/>
+              <w:right w:w="120" w:type="dxa"/>
+            </w:tcMar>
+          </w:tcPr>
+          <w:p>
+            <w:r>
+              <w:rPr>
+                <w:rFonts w:ascii="Wix Madefor Display" w:hAnsi="Wix Madefor Display" w:cs="Wix Madefor Display"/>
+                <w:color w:val="000000"/>
+                <w:sz w:val="15"/>
+                <w:szCs w:val="15"/>
+              </w:rPr>
+              <w:t xml:space="preserve">7</w:t>
+            </w:r>
+          </w:p>
+        </w:tc>
+        <w:tc>
+          <w:tcPr>
+            <w:tcW w:w="10000" w:type="dxa"/>
+            <w:tcBorders>
+              <w:top w:val="single" w:sz="4" w:space="0" w:color="DDDDDD"/>
+              <w:left w:val="single" w:sz="4" w:space="0" w:color="DDDDDD"/>
+              <w:bottom w:val="single" w:sz="4" w:space="0" w:color="DDDDDD"/>
+              <w:right w:val="single" w:sz="4" w:space="0" w:color="DDDDDD"/>
+            </w:tcBorders>
+            <w:shd w:val="clear" w:color="auto" w:fill="F5F8FF"/>
+            <w:tcMar>
+              <w:top w:w="80" w:type="dxa"/>
+              <w:left w:w="120" w:type="dxa"/>
+              <w:bottom w:w="80" w:type="dxa"/>
+              <w:right w:w="120" w:type="dxa"/>
+            </w:tcMar>
+          </w:tcPr>
+          <w:p>
+            <w:r>
+              <w:rPr>
+                <w:rFonts w:ascii="Wix Madefor Display" w:hAnsi="Wix Madefor Display" w:cs="Wix Madefor Display"/>
+                <w:color w:val="000000"/>
+                <w:sz w:val="15"/>
+                <w:szCs w:val="15"/>
+              </w:rPr>
+              <w:t xml:space="preserve">Workflow Chains</w:t>
+            </w:r>
+          </w:p>
+        </w:tc>
+      </w:tr>
+      <w:tr>
+        <w:tc>
+          <w:tcPr>
+            <w:tcW w:w="800" w:type="dxa"/>
+            <w:tcBorders>
+              <w:top w:val="single" w:sz="4" w:space="0" w:color="DDDDDD"/>
+              <w:left w:val="single" w:sz="4" w:space="0" w:color="DDDDDD"/>
+              <w:bottom w:val="single" w:sz="4" w:space="0" w:color="DDDDDD"/>
+              <w:right w:val="single" w:sz="4" w:space="0" w:color="DDDDDD"/>
+            </w:tcBorders>
+            <w:shd w:val="clear" w:color="auto" w:fill="FFFFFF"/>
+            <w:tcMar>
+              <w:top w:w="80" w:type="dxa"/>
+              <w:left w:w="120" w:type="dxa"/>
+              <w:bottom w:w="80" w:type="dxa"/>
+              <w:right w:w="120" w:type="dxa"/>
+            </w:tcMar>
+          </w:tcPr>
+          <w:p>
+            <w:r>
+              <w:rPr>
+                <w:rFonts w:ascii="Wix Madefor Display" w:hAnsi="Wix Madefor Display" w:cs="Wix Madefor Display"/>
+                <w:color w:val="000000"/>
+                <w:sz w:val="15"/>
+                <w:szCs w:val="15"/>
+              </w:rPr>
+              <w:t xml:space="preserve">8</w:t>
+            </w:r>
+          </w:p>
+        </w:tc>
+        <w:tc>
+          <w:tcPr>
+            <w:tcW w:w="10000" w:type="dxa"/>
+            <w:tcBorders>
+              <w:top w:val="single" w:sz="4" w:space="0" w:color="DDDDDD"/>
+              <w:left w:val="single" w:sz="4" w:space="0" w:color="DDDDDD"/>
+              <w:bottom w:val="single" w:sz="4" w:space="0" w:color="DDDDDD"/>
+              <w:right w:val="single" w:sz="4" w:space="0" w:color="DDDDDD"/>
+            </w:tcBorders>
+            <w:shd w:val="clear" w:color="auto" w:fill="FFFFFF"/>
+            <w:tcMar>
+              <w:top w:w="80" w:type="dxa"/>
+              <w:left w:w="120" w:type="dxa"/>
+              <w:bottom w:w="80" w:type="dxa"/>
+              <w:right w:w="120" w:type="dxa"/>
+            </w:tcMar>
+          </w:tcPr>
+          <w:p>
+            <w:r>
+              <w:rPr>
+                <w:rFonts w:ascii="Wix Madefor Display" w:hAnsi="Wix Madefor Display" w:cs="Wix Madefor Display"/>
+                <w:color w:val="000000"/>
+                <w:sz w:val="15"/>
+                <w:szCs w:val="15"/>
+              </w:rPr>
+              <w:t xml:space="preserve">Reference Files</w:t>
+            </w:r>
+          </w:p>
+        </w:tc>
+      </w:tr>
+      <w:tr>
+        <w:tc>
+          <w:tcPr>
+            <w:tcW w:w="800" w:type="dxa"/>
+            <w:tcBorders>
+              <w:top w:val="single" w:sz="4" w:space="0" w:color="DDDDDD"/>
+              <w:left w:val="single" w:sz="4" w:space="0" w:color="DDDDDD"/>
+              <w:bottom w:val="single" w:sz="4" w:space="0" w:color="DDDDDD"/>
+              <w:right w:val="single" w:sz="4" w:space="0" w:color="DDDDDD"/>
+            </w:tcBorders>
+            <w:shd w:val="clear" w:color="auto" w:fill="F5F8FF"/>
+            <w:tcMar>
+              <w:top w:w="80" w:type="dxa"/>
+              <w:left w:w="120" w:type="dxa"/>
+              <w:bottom w:w="80" w:type="dxa"/>
+              <w:right w:w="120" w:type="dxa"/>
+            </w:tcMar>
+          </w:tcPr>
+          <w:p>
+            <w:r>
+              <w:rPr>
+                <w:rFonts w:ascii="Wix Madefor Display" w:hAnsi="Wix Madefor Display" w:cs="Wix Madefor Display"/>
+                <w:color w:val="000000"/>
+                <w:sz w:val="15"/>
+                <w:szCs w:val="15"/>
+              </w:rPr>
+              <w:t xml:space="preserve">9</w:t>
+            </w:r>
+          </w:p>
+        </w:tc>
+        <w:tc>
+          <w:tcPr>
+            <w:tcW w:w="10000" w:type="dxa"/>
+            <w:tcBorders>
+              <w:top w:val="single" w:sz="4" w:space="0" w:color="DDDDDD"/>
+              <w:left w:val="single" w:sz="4" w:space="0" w:color="DDDDDD"/>
+              <w:bottom w:val="single" w:sz="4" w:space="0" w:color="DDDDDD"/>
+              <w:right w:val="single" w:sz="4" w:space="0" w:color="DDDDDD"/>
+            </w:tcBorders>
+            <w:shd w:val="clear" w:color="auto" w:fill="F5F8FF"/>
+            <w:tcMar>
+              <w:top w:w="80" w:type="dxa"/>
+              <w:left w:w="120" w:type="dxa"/>
+              <w:bottom w:w="80" w:type="dxa"/>
+              <w:right w:w="120" w:type="dxa"/>
+            </w:tcMar>
+          </w:tcPr>
+          <w:p>
+            <w:r>
+              <w:rPr>
+                <w:rFonts w:ascii="Wix Madefor Display" w:hAnsi="Wix Madefor Display" w:cs="Wix Madefor Display"/>
+                <w:color w:val="000000"/>
+                <w:sz w:val="15"/>
+                <w:szCs w:val="15"/>
+              </w:rPr>
+              <w:t xml:space="preserve">Skills Directory</w:t>
+            </w:r>
+          </w:p>
+        </w:tc>
+      </w:tr>
+      <w:tr>
+        <w:tc>
+          <w:tcPr>
+            <w:tcW w:w="800" w:type="dxa"/>
+            <w:tcBorders>
+              <w:top w:val="single" w:sz="4" w:space="0" w:color="DDDDDD"/>
+              <w:left w:val="single" w:sz="4" w:space="0" w:color="DDDDDD"/>
+              <w:bottom w:val="single" w:sz="4" w:space="0" w:color="DDDDDD"/>
+              <w:right w:val="single" w:sz="4" w:space="0" w:color="DDDDDD"/>
+            </w:tcBorders>
+            <w:shd w:val="clear" w:color="auto" w:fill="FFFFFF"/>
+            <w:tcMar>
+              <w:top w:w="80" w:type="dxa"/>
+              <w:left w:w="120" w:type="dxa"/>
+              <w:bottom w:w="80" w:type="dxa"/>
+              <w:right w:w="120" w:type="dxa"/>
+            </w:tcMar>
+          </w:tcPr>
+          <w:p>
+            <w:r>
+              <w:rPr>
+                <w:rFonts w:ascii="Wix Madefor Display" w:hAnsi="Wix Madefor Display" w:cs="Wix Madefor Display"/>
+                <w:color w:val="000000"/>
+                <w:sz w:val="15"/>
+                <w:szCs w:val="15"/>
+              </w:rPr>
+              <w:t xml:space="preserve">10</w:t>
+            </w:r>
+          </w:p>
+        </w:tc>
+        <w:tc>
+          <w:tcPr>
+            <w:tcW w:w="10000" w:type="dxa"/>
+            <w:tcBorders>
+              <w:top w:val="single" w:sz="4" w:space="0" w:color="DDDDDD"/>
+              <w:left w:val="single" w:sz="4" w:space="0" w:color="DDDDDD"/>
+              <w:bottom w:val="single" w:sz="4" w:space="0" w:color="DDDDDD"/>
+              <w:right w:val="single" w:sz="4" w:space="0" w:color="DDDDDD"/>
+            </w:tcBorders>
+            <w:shd w:val="clear" w:color="auto" w:fill="FFFFFF"/>
+            <w:tcMar>
+              <w:top w:w="80" w:type="dxa"/>
+              <w:left w:w="120" w:type="dxa"/>
+              <w:bottom w:w="80" w:type="dxa"/>
+              <w:right w:w="120" w:type="dxa"/>
+            </w:tcMar>
+          </w:tcPr>
+          <w:p>
+            <w:r>
+              <w:rPr>
+                <w:rFonts w:ascii="Wix Madefor Display" w:hAnsi="Wix Madefor Display" w:cs="Wix Madefor Display"/>
+                <w:color w:val="000000"/>
+                <w:sz w:val="15"/>
+                <w:szCs w:val="15"/>
+              </w:rPr>
+              <w:t xml:space="preserve">Plugins (PE/M&amp;A Workflow)</w:t>
+            </w:r>
+          </w:p>
+        </w:tc>
+      </w:tr>
+    </w:tbl>
+    <w:p>
+      <w:pPr>
+        <w:spacing w:after="80"/>
+      </w:pPr>
+    </w:p>
+    <w:p>
+      <w:pPr>
         <w:pBdr>
           <w:bottom w:val="single" w:sz="4" w:space="2" w:color="BBBBBB"/>
         </w:pBdr>
@@ -15779,6 +15779,31 @@
     </w:tbl>
     <w:p>
       <w:pPr>
+        <w:spacing w:after="120"/>
+      </w:pPr>
+      <w:r>
+        <w:rPr>
+          <w:rFonts w:ascii="Wix Madefor Display" w:hAnsi="Wix Madefor Display" w:cs="Wix Madefor Display"/>
+          <w:b/>
+          <w:bCs/>
+          <w:color w:val="000000"/>
+          <w:sz w:val="18"/>
+          <w:szCs w:val="18"/>
+        </w:rPr>
+        <w:t xml:space="preserve">Note: </w:t>
+      </w:r>
+      <w:r>
+        <w:rPr>
+          <w:rFonts w:ascii="Wix Madefor Display" w:hAnsi="Wix Madefor Display" w:cs="Wix Madefor Display"/>
+          <w:color w:val="000000"/>
+          <w:sz w:val="18"/>
+          <w:szCs w:val="18"/>
+        </w:rPr>
+        <w:t xml:space="preserve">The above covers the screening and quality flow. For Phase 3 deep diligence (ntb-diligence, driver-tree, financial-model-builder, gtm-metrics-analyzer, kpi-tree-builder), use the deal-intelligence plugin (Section 10) which sequences all phases with explicit gates.</w:t>
+      </w:r>
+    </w:p>
+    <w:p>
+      <w:pPr>
         <w:pageBreakBefore/>
         <w:pBdr>
           <w:bottom w:val="single" w:sz="4" w:space="2" w:color="BBBBBB"/>
@@ -15794,31 +15819,6 @@
           <w:szCs w:val="22"/>
         </w:rPr>
         <w:lastRenderedPageBreak/>
-        <w:p>
-          <w:pPr>
-            <w:spacing w:after="120"/>
-          </w:pPr>
-          <w:r>
-            <w:rPr>
-              <w:rFonts w:ascii="Wix Madefor Display" w:hAnsi="Wix Madefor Display" w:cs="Wix Madefor Display"/>
-              <w:b/>
-              <w:bCs/>
-              <w:color w:val="000000"/>
-              <w:sz w:val="18"/>
-              <w:szCs w:val="18"/>
-            </w:rPr>
-            <w:t xml:space="preserve">Note: </w:t>
-          </w:r>
-          <w:r>
-            <w:rPr>
-              <w:rFonts w:ascii="Wix Madefor Display" w:hAnsi="Wix Madefor Display" w:cs="Wix Madefor Display"/>
-              <w:color w:val="000000"/>
-              <w:sz w:val="18"/>
-              <w:szCs w:val="18"/>
-            </w:rPr>
-            <w:t xml:space="preserve">The above covers the screening and quality flow. For Phase 3 deep diligence (ntb-diligence, driver-tree, financial-model-builder, gtm-metrics-analyzer, kpi-tree-builder), use the deal-intelligence plugin (Section 10) which sequences all phases with explicit gates.</w:t>
-          </w:r>
-        </w:p>
         <w:t>8. Reference Files</w:t>
       </w:r>
     </w:p>

</xml_diff>

<commit_message>
Update CheatSheet + Library: add 4 missing skills, May 2026 date
CheatSheet v2 (31 -> 35 skills):
  + vibe-coding (L7)
  + skill-authoring-workflow (L8)
  + deal-workbook-builder (L4)
  + earnings-reviewer (Plugin summary row)
  Updated date: April -> May 2026

Claude Skill Library Finance v6 (30 -> 37 skills):
  + managing-up, written-communication, giving-presentations, executive-briefing (L4 Production)
  + vibe-coding, skill-authoring-workflow (L6 Utility)
  + deal-workbook-builder (L4 Production)
  Updated date: April -> May 2026

Also: add patch_docs_v3.py build script

Co-Authored-By: Claude Sonnet 4.6 <noreply@anthropic.com>
</commit_message>
<xml_diff>
--- a/docs/Claude_Skill_Library_External (Finance)_v6.docx
+++ b/docs/Claude_Skill_Library_External (Finance)_v6.docx
@@ -1647,7 +1647,7 @@
         <w:rPr>
           <w:rFonts w:ascii="Wix Madefor Display SemiBold" w:eastAsia="Wix Madefor Display SemiBold" w:hAnsi="Wix Madefor Display SemiBold" w:cs="Wix Madefor Display SemiBold"/>
         </w:rPr>
-        <w:t>30 skills across five layers. Skills marked * have been updated in May 2026.</w:t>
+        <w:t>37 skills across five layers. Skills marked * have been updated in May 2026.</w:t>
       </w:r>
     </w:p>
     <w:p>
@@ -2012,6 +2012,776 @@
                 <w:szCs w:val="15"/>
               </w:rPr>
               <w:t xml:space="preserve">mckinsey-consultant, writing-style, claim-scrutinizer, red-team, competitive-moat-assessment (L2b), pattern-docx / pattern-investment-pptx</w:t>
+            </w:r>
+          </w:p>
+        </w:tc>
+      </w:tr>
+      <w:tr>
+        <w:tc>
+          <w:tcPr>
+            <w:tcW w:w="1200" w:type="dxa"/>
+            <w:tcBorders>
+              <w:top w:val="single" w:sz="4" w:space="0" w:color="DDDDDD"/>
+              <w:left w:val="single" w:sz="4" w:space="0" w:color="DDDDDD"/>
+              <w:bottom w:val="single" w:sz="4" w:space="0" w:color="DDDDDD"/>
+              <w:right w:val="single" w:sz="4" w:space="0" w:color="DDDDDD"/>
+            </w:tcBorders>
+            <w:shd w:val="clear" w:color="auto" w:fill="F2F2F2"/>
+            <w:tcMar>
+              <w:top w:w="80" w:type="dxa"/>
+              <w:left w:w="120" w:type="dxa"/>
+              <w:bottom w:w="80" w:type="dxa"/>
+              <w:right w:w="120" w:type="dxa"/>
+            </w:tcMar>
+          </w:tcPr>
+          <w:p>
+            <w:r>
+              <w:rPr>
+                <w:sz w:val="15"/>
+                <w:szCs w:val="15"/>
+              </w:rPr>
+              <w:t xml:space="preserve">4 -- Production</w:t>
+            </w:r>
+          </w:p>
+        </w:tc>
+        <w:tc>
+          <w:tcPr>
+            <w:tcW w:w="2400" w:type="dxa"/>
+            <w:tcBorders>
+              <w:top w:val="single" w:sz="4" w:space="0" w:color="DDDDDD"/>
+              <w:left w:val="single" w:sz="4" w:space="0" w:color="DDDDDD"/>
+              <w:bottom w:val="single" w:sz="4" w:space="0" w:color="DDDDDD"/>
+              <w:right w:val="single" w:sz="4" w:space="0" w:color="DDDDDD"/>
+            </w:tcBorders>
+            <w:shd w:val="clear" w:color="auto" w:fill="F2F2F2"/>
+            <w:tcMar>
+              <w:top w:w="80" w:type="dxa"/>
+              <w:left w:w="120" w:type="dxa"/>
+              <w:bottom w:w="80" w:type="dxa"/>
+              <w:right w:w="120" w:type="dxa"/>
+            </w:tcMar>
+          </w:tcPr>
+          <w:p>
+            <w:r>
+              <w:rPr>
+                <w:sz w:val="15"/>
+                <w:szCs w:val="15"/>
+              </w:rPr>
+              <w:t xml:space="preserve">managing-up</w:t>
+            </w:r>
+          </w:p>
+        </w:tc>
+        <w:tc>
+          <w:tcPr>
+            <w:tcW w:w="4200" w:type="dxa"/>
+            <w:tcBorders>
+              <w:top w:val="single" w:sz="4" w:space="0" w:color="DDDDDD"/>
+              <w:left w:val="single" w:sz="4" w:space="0" w:color="DDDDDD"/>
+              <w:bottom w:val="single" w:sz="4" w:space="0" w:color="DDDDDD"/>
+              <w:right w:val="single" w:sz="4" w:space="0" w:color="DDDDDD"/>
+            </w:tcBorders>
+            <w:shd w:val="clear" w:color="auto" w:fill="F2F2F2"/>
+            <w:tcMar>
+              <w:top w:w="80" w:type="dxa"/>
+              <w:left w:w="120" w:type="dxa"/>
+              <w:bottom w:w="80" w:type="dxa"/>
+              <w:right w:w="120" w:type="dxa"/>
+            </w:tcMar>
+          </w:tcPr>
+          <w:p>
+            <w:r>
+              <w:rPr>
+                <w:sz w:val="15"/>
+                <w:szCs w:val="15"/>
+              </w:rPr>
+              <w:t xml:space="preserve">Frameworks for executive relationship management, influencing leadership without authority, and navigating organizational dynamics. Covers upward communication, alignment, and managing difficult conversations.</w:t>
+            </w:r>
+          </w:p>
+        </w:tc>
+        <w:tc>
+          <w:tcPr>
+            <w:tcW w:w="3000" w:type="dxa"/>
+            <w:tcBorders>
+              <w:top w:val="single" w:sz="4" w:space="0" w:color="DDDDDD"/>
+              <w:left w:val="single" w:sz="4" w:space="0" w:color="DDDDDD"/>
+              <w:bottom w:val="single" w:sz="4" w:space="0" w:color="DDDDDD"/>
+              <w:right w:val="single" w:sz="4" w:space="0" w:color="DDDDDD"/>
+            </w:tcBorders>
+            <w:shd w:val="clear" w:color="auto" w:fill="F2F2F2"/>
+            <w:tcMar>
+              <w:top w:w="80" w:type="dxa"/>
+              <w:left w:w="120" w:type="dxa"/>
+              <w:bottom w:w="80" w:type="dxa"/>
+              <w:right w:w="120" w:type="dxa"/>
+            </w:tcMar>
+          </w:tcPr>
+          <w:p>
+            <w:r>
+              <w:rPr>
+                <w:sz w:val="15"/>
+                <w:szCs w:val="15"/>
+              </w:rPr>
+              <w:t xml:space="preserve">mckinsey-consultant, writing-style</w:t>
+            </w:r>
+          </w:p>
+        </w:tc>
+      </w:tr>
+      <w:tr>
+        <w:tc>
+          <w:tcPr>
+            <w:tcW w:w="1200" w:type="dxa"/>
+            <w:tcBorders>
+              <w:top w:val="single" w:sz="4" w:space="0" w:color="DDDDDD"/>
+              <w:left w:val="single" w:sz="4" w:space="0" w:color="DDDDDD"/>
+              <w:bottom w:val="single" w:sz="4" w:space="0" w:color="DDDDDD"/>
+              <w:right w:val="single" w:sz="4" w:space="0" w:color="DDDDDD"/>
+            </w:tcBorders>
+            <w:shd w:val="clear" w:color="auto" w:fill="F2F2F2"/>
+            <w:tcMar>
+              <w:top w:w="80" w:type="dxa"/>
+              <w:left w:w="120" w:type="dxa"/>
+              <w:bottom w:w="80" w:type="dxa"/>
+              <w:right w:w="120" w:type="dxa"/>
+            </w:tcMar>
+          </w:tcPr>
+          <w:p>
+            <w:r>
+              <w:rPr>
+                <w:sz w:val="15"/>
+                <w:szCs w:val="15"/>
+              </w:rPr>
+              <w:t xml:space="preserve">4 -- Production</w:t>
+            </w:r>
+          </w:p>
+        </w:tc>
+        <w:tc>
+          <w:tcPr>
+            <w:tcW w:w="2400" w:type="dxa"/>
+            <w:tcBorders>
+              <w:top w:val="single" w:sz="4" w:space="0" w:color="DDDDDD"/>
+              <w:left w:val="single" w:sz="4" w:space="0" w:color="DDDDDD"/>
+              <w:bottom w:val="single" w:sz="4" w:space="0" w:color="DDDDDD"/>
+              <w:right w:val="single" w:sz="4" w:space="0" w:color="DDDDDD"/>
+            </w:tcBorders>
+            <w:shd w:val="clear" w:color="auto" w:fill="F2F2F2"/>
+            <w:tcMar>
+              <w:top w:w="80" w:type="dxa"/>
+              <w:left w:w="120" w:type="dxa"/>
+              <w:bottom w:w="80" w:type="dxa"/>
+              <w:right w:w="120" w:type="dxa"/>
+            </w:tcMar>
+          </w:tcPr>
+          <w:p>
+            <w:r>
+              <w:rPr>
+                <w:sz w:val="15"/>
+                <w:szCs w:val="15"/>
+              </w:rPr>
+              <w:t xml:space="preserve">written-communication</w:t>
+            </w:r>
+          </w:p>
+        </w:tc>
+        <w:tc>
+          <w:tcPr>
+            <w:tcW w:w="4200" w:type="dxa"/>
+            <w:tcBorders>
+              <w:top w:val="single" w:sz="4" w:space="0" w:color="DDDDDD"/>
+              <w:left w:val="single" w:sz="4" w:space="0" w:color="DDDDDD"/>
+              <w:bottom w:val="single" w:sz="4" w:space="0" w:color="DDDDDD"/>
+              <w:right w:val="single" w:sz="4" w:space="0" w:color="DDDDDD"/>
+            </w:tcBorders>
+            <w:shd w:val="clear" w:color="auto" w:fill="F2F2F2"/>
+            <w:tcMar>
+              <w:top w:w="80" w:type="dxa"/>
+              <w:left w:w="120" w:type="dxa"/>
+              <w:bottom w:w="80" w:type="dxa"/>
+              <w:right w:w="120" w:type="dxa"/>
+            </w:tcMar>
+          </w:tcPr>
+          <w:p>
+            <w:r>
+              <w:rPr>
+                <w:sz w:val="15"/>
+                <w:szCs w:val="15"/>
+              </w:rPr>
+              <w:t xml:space="preserve">Emails, memos, strategy documents, and announcements. Tone calibration for audience and stakes, structure selection (BLUF vs. narrative), and edit passes. For external communications and internal alignment.</w:t>
+            </w:r>
+          </w:p>
+        </w:tc>
+        <w:tc>
+          <w:tcPr>
+            <w:tcW w:w="3000" w:type="dxa"/>
+            <w:tcBorders>
+              <w:top w:val="single" w:sz="4" w:space="0" w:color="DDDDDD"/>
+              <w:left w:val="single" w:sz="4" w:space="0" w:color="DDDDDD"/>
+              <w:bottom w:val="single" w:sz="4" w:space="0" w:color="DDDDDD"/>
+              <w:right w:val="single" w:sz="4" w:space="0" w:color="DDDDDD"/>
+            </w:tcBorders>
+            <w:shd w:val="clear" w:color="auto" w:fill="F2F2F2"/>
+            <w:tcMar>
+              <w:top w:w="80" w:type="dxa"/>
+              <w:left w:w="120" w:type="dxa"/>
+              <w:bottom w:w="80" w:type="dxa"/>
+              <w:right w:w="120" w:type="dxa"/>
+            </w:tcMar>
+          </w:tcPr>
+          <w:p>
+            <w:r>
+              <w:rPr>
+                <w:sz w:val="15"/>
+                <w:szCs w:val="15"/>
+              </w:rPr>
+              <w:t xml:space="preserve">writing-style, mckinsey-consultant</w:t>
+            </w:r>
+          </w:p>
+        </w:tc>
+      </w:tr>
+      <w:tr>
+        <w:tc>
+          <w:tcPr>
+            <w:tcW w:w="1200" w:type="dxa"/>
+            <w:tcBorders>
+              <w:top w:val="single" w:sz="4" w:space="0" w:color="DDDDDD"/>
+              <w:left w:val="single" w:sz="4" w:space="0" w:color="DDDDDD"/>
+              <w:bottom w:val="single" w:sz="4" w:space="0" w:color="DDDDDD"/>
+              <w:right w:val="single" w:sz="4" w:space="0" w:color="DDDDDD"/>
+            </w:tcBorders>
+            <w:shd w:val="clear" w:color="auto" w:fill="F2F2F2"/>
+            <w:tcMar>
+              <w:top w:w="80" w:type="dxa"/>
+              <w:left w:w="120" w:type="dxa"/>
+              <w:bottom w:w="80" w:type="dxa"/>
+              <w:right w:w="120" w:type="dxa"/>
+            </w:tcMar>
+          </w:tcPr>
+          <w:p>
+            <w:r>
+              <w:rPr>
+                <w:sz w:val="15"/>
+                <w:szCs w:val="15"/>
+              </w:rPr>
+              <w:t xml:space="preserve">4 -- Production</w:t>
+            </w:r>
+          </w:p>
+        </w:tc>
+        <w:tc>
+          <w:tcPr>
+            <w:tcW w:w="2400" w:type="dxa"/>
+            <w:tcBorders>
+              <w:top w:val="single" w:sz="4" w:space="0" w:color="DDDDDD"/>
+              <w:left w:val="single" w:sz="4" w:space="0" w:color="DDDDDD"/>
+              <w:bottom w:val="single" w:sz="4" w:space="0" w:color="DDDDDD"/>
+              <w:right w:val="single" w:sz="4" w:space="0" w:color="DDDDDD"/>
+            </w:tcBorders>
+            <w:shd w:val="clear" w:color="auto" w:fill="F2F2F2"/>
+            <w:tcMar>
+              <w:top w:w="80" w:type="dxa"/>
+              <w:left w:w="120" w:type="dxa"/>
+              <w:bottom w:w="80" w:type="dxa"/>
+              <w:right w:w="120" w:type="dxa"/>
+            </w:tcMar>
+          </w:tcPr>
+          <w:p>
+            <w:r>
+              <w:rPr>
+                <w:sz w:val="15"/>
+                <w:szCs w:val="15"/>
+              </w:rPr>
+              <w:t xml:space="preserve">giving-presentations</w:t>
+            </w:r>
+          </w:p>
+        </w:tc>
+        <w:tc>
+          <w:tcPr>
+            <w:tcW w:w="4200" w:type="dxa"/>
+            <w:tcBorders>
+              <w:top w:val="single" w:sz="4" w:space="0" w:color="DDDDDD"/>
+              <w:left w:val="single" w:sz="4" w:space="0" w:color="DDDDDD"/>
+              <w:bottom w:val="single" w:sz="4" w:space="0" w:color="DDDDDD"/>
+              <w:right w:val="single" w:sz="4" w:space="0" w:color="DDDDDD"/>
+            </w:tcBorders>
+            <w:shd w:val="clear" w:color="auto" w:fill="F2F2F2"/>
+            <w:tcMar>
+              <w:top w:w="80" w:type="dxa"/>
+              <w:left w:w="120" w:type="dxa"/>
+              <w:bottom w:w="80" w:type="dxa"/>
+              <w:right w:w="120" w:type="dxa"/>
+            </w:tcMar>
+          </w:tcPr>
+          <w:p>
+            <w:r>
+              <w:rPr>
+                <w:sz w:val="15"/>
+                <w:szCs w:val="15"/>
+              </w:rPr>
+              <w:t xml:space="preserve">Talk track preparation, slide deck narrative design, and delivery coaching. Maps content to audience decision needs. Structures opening hook, logical flow, and close.</w:t>
+            </w:r>
+          </w:p>
+        </w:tc>
+        <w:tc>
+          <w:tcPr>
+            <w:tcW w:w="3000" w:type="dxa"/>
+            <w:tcBorders>
+              <w:top w:val="single" w:sz="4" w:space="0" w:color="DDDDDD"/>
+              <w:left w:val="single" w:sz="4" w:space="0" w:color="DDDDDD"/>
+              <w:bottom w:val="single" w:sz="4" w:space="0" w:color="DDDDDD"/>
+              <w:right w:val="single" w:sz="4" w:space="0" w:color="DDDDDD"/>
+            </w:tcBorders>
+            <w:shd w:val="clear" w:color="auto" w:fill="F2F2F2"/>
+            <w:tcMar>
+              <w:top w:w="80" w:type="dxa"/>
+              <w:left w:w="120" w:type="dxa"/>
+              <w:bottom w:w="80" w:type="dxa"/>
+              <w:right w:w="120" w:type="dxa"/>
+            </w:tcMar>
+          </w:tcPr>
+          <w:p>
+            <w:r>
+              <w:rPr>
+                <w:sz w:val="15"/>
+                <w:szCs w:val="15"/>
+              </w:rPr>
+              <w:t xml:space="preserve">writing-style, mckinsey-consultant</w:t>
+            </w:r>
+          </w:p>
+        </w:tc>
+      </w:tr>
+      <w:tr>
+        <w:tc>
+          <w:tcPr>
+            <w:tcW w:w="1200" w:type="dxa"/>
+            <w:tcBorders>
+              <w:top w:val="single" w:sz="4" w:space="0" w:color="DDDDDD"/>
+              <w:left w:val="single" w:sz="4" w:space="0" w:color="DDDDDD"/>
+              <w:bottom w:val="single" w:sz="4" w:space="0" w:color="DDDDDD"/>
+              <w:right w:val="single" w:sz="4" w:space="0" w:color="DDDDDD"/>
+            </w:tcBorders>
+            <w:shd w:val="clear" w:color="auto" w:fill="F2F2F2"/>
+            <w:tcMar>
+              <w:top w:w="80" w:type="dxa"/>
+              <w:left w:w="120" w:type="dxa"/>
+              <w:bottom w:w="80" w:type="dxa"/>
+              <w:right w:w="120" w:type="dxa"/>
+            </w:tcMar>
+          </w:tcPr>
+          <w:p>
+            <w:r>
+              <w:rPr>
+                <w:sz w:val="15"/>
+                <w:szCs w:val="15"/>
+              </w:rPr>
+              <w:t xml:space="preserve">4 -- Production</w:t>
+            </w:r>
+          </w:p>
+        </w:tc>
+        <w:tc>
+          <w:tcPr>
+            <w:tcW w:w="2400" w:type="dxa"/>
+            <w:tcBorders>
+              <w:top w:val="single" w:sz="4" w:space="0" w:color="DDDDDD"/>
+              <w:left w:val="single" w:sz="4" w:space="0" w:color="DDDDDD"/>
+              <w:bottom w:val="single" w:sz="4" w:space="0" w:color="DDDDDD"/>
+              <w:right w:val="single" w:sz="4" w:space="0" w:color="DDDDDD"/>
+            </w:tcBorders>
+            <w:shd w:val="clear" w:color="auto" w:fill="F2F2F2"/>
+            <w:tcMar>
+              <w:top w:w="80" w:type="dxa"/>
+              <w:left w:w="120" w:type="dxa"/>
+              <w:bottom w:w="80" w:type="dxa"/>
+              <w:right w:w="120" w:type="dxa"/>
+            </w:tcMar>
+          </w:tcPr>
+          <w:p>
+            <w:r>
+              <w:rPr>
+                <w:sz w:val="15"/>
+                <w:szCs w:val="15"/>
+              </w:rPr>
+              <w:t xml:space="preserve">executive-briefing</w:t>
+            </w:r>
+          </w:p>
+        </w:tc>
+        <w:tc>
+          <w:tcPr>
+            <w:tcW w:w="4200" w:type="dxa"/>
+            <w:tcBorders>
+              <w:top w:val="single" w:sz="4" w:space="0" w:color="DDDDDD"/>
+              <w:left w:val="single" w:sz="4" w:space="0" w:color="DDDDDD"/>
+              <w:bottom w:val="single" w:sz="4" w:space="0" w:color="DDDDDD"/>
+              <w:right w:val="single" w:sz="4" w:space="0" w:color="DDDDDD"/>
+            </w:tcBorders>
+            <w:shd w:val="clear" w:color="auto" w:fill="F2F2F2"/>
+            <w:tcMar>
+              <w:top w:w="80" w:type="dxa"/>
+              <w:left w:w="120" w:type="dxa"/>
+              <w:bottom w:w="80" w:type="dxa"/>
+              <w:right w:w="120" w:type="dxa"/>
+            </w:tcMar>
+          </w:tcPr>
+          <w:p>
+            <w:r>
+              <w:rPr>
+                <w:sz w:val="15"/>
+                <w:szCs w:val="15"/>
+              </w:rPr>
+              <w:t xml:space="preserve">Executive-ready briefing documents: memos, one-pagers, board notes, C-suite briefings. Enforces BLUF structure and decision-oriented formatting. Output is action-forcing, not informational.</w:t>
+            </w:r>
+          </w:p>
+        </w:tc>
+        <w:tc>
+          <w:tcPr>
+            <w:tcW w:w="3000" w:type="dxa"/>
+            <w:tcBorders>
+              <w:top w:val="single" w:sz="4" w:space="0" w:color="DDDDDD"/>
+              <w:left w:val="single" w:sz="4" w:space="0" w:color="DDDDDD"/>
+              <w:bottom w:val="single" w:sz="4" w:space="0" w:color="DDDDDD"/>
+              <w:right w:val="single" w:sz="4" w:space="0" w:color="DDDDDD"/>
+            </w:tcBorders>
+            <w:shd w:val="clear" w:color="auto" w:fill="F2F2F2"/>
+            <w:tcMar>
+              <w:top w:w="80" w:type="dxa"/>
+              <w:left w:w="120" w:type="dxa"/>
+              <w:bottom w:w="80" w:type="dxa"/>
+              <w:right w:w="120" w:type="dxa"/>
+            </w:tcMar>
+          </w:tcPr>
+          <w:p>
+            <w:r>
+              <w:rPr>
+                <w:sz w:val="15"/>
+                <w:szCs w:val="15"/>
+              </w:rPr>
+              <w:t xml:space="preserve">pattern-docx, writing-style</w:t>
+            </w:r>
+          </w:p>
+        </w:tc>
+      </w:tr>
+      <w:tr>
+        <w:tc>
+          <w:tcPr>
+            <w:tcW w:w="1200" w:type="dxa"/>
+            <w:tcBorders>
+              <w:top w:val="single" w:sz="4" w:space="0" w:color="DDDDDD"/>
+              <w:left w:val="single" w:sz="4" w:space="0" w:color="DDDDDD"/>
+              <w:bottom w:val="single" w:sz="4" w:space="0" w:color="DDDDDD"/>
+              <w:right w:val="single" w:sz="4" w:space="0" w:color="DDDDDD"/>
+            </w:tcBorders>
+            <w:shd w:val="clear" w:color="auto" w:fill="F2F2F2"/>
+            <w:tcMar>
+              <w:top w:w="80" w:type="dxa"/>
+              <w:left w:w="120" w:type="dxa"/>
+              <w:bottom w:w="80" w:type="dxa"/>
+              <w:right w:w="120" w:type="dxa"/>
+            </w:tcMar>
+          </w:tcPr>
+          <w:p>
+            <w:r>
+              <w:rPr>
+                <w:sz w:val="15"/>
+                <w:szCs w:val="15"/>
+              </w:rPr>
+              <w:t xml:space="preserve">6 -- Utility</w:t>
+            </w:r>
+          </w:p>
+        </w:tc>
+        <w:tc>
+          <w:tcPr>
+            <w:tcW w:w="2400" w:type="dxa"/>
+            <w:tcBorders>
+              <w:top w:val="single" w:sz="4" w:space="0" w:color="DDDDDD"/>
+              <w:left w:val="single" w:sz="4" w:space="0" w:color="DDDDDD"/>
+              <w:bottom w:val="single" w:sz="4" w:space="0" w:color="DDDDDD"/>
+              <w:right w:val="single" w:sz="4" w:space="0" w:color="DDDDDD"/>
+            </w:tcBorders>
+            <w:shd w:val="clear" w:color="auto" w:fill="F2F2F2"/>
+            <w:tcMar>
+              <w:top w:w="80" w:type="dxa"/>
+              <w:left w:w="120" w:type="dxa"/>
+              <w:bottom w:w="80" w:type="dxa"/>
+              <w:right w:w="120" w:type="dxa"/>
+            </w:tcMar>
+          </w:tcPr>
+          <w:p>
+            <w:r>
+              <w:rPr>
+                <w:sz w:val="15"/>
+                <w:szCs w:val="15"/>
+              </w:rPr>
+              <w:t xml:space="preserve">vibe-coding</w:t>
+            </w:r>
+          </w:p>
+        </w:tc>
+        <w:tc>
+          <w:tcPr>
+            <w:tcW w:w="4200" w:type="dxa"/>
+            <w:tcBorders>
+              <w:top w:val="single" w:sz="4" w:space="0" w:color="DDDDDD"/>
+              <w:left w:val="single" w:sz="4" w:space="0" w:color="DDDDDD"/>
+              <w:bottom w:val="single" w:sz="4" w:space="0" w:color="DDDDDD"/>
+              <w:right w:val="single" w:sz="4" w:space="0" w:color="DDDDDD"/>
+            </w:tcBorders>
+            <w:shd w:val="clear" w:color="auto" w:fill="F2F2F2"/>
+            <w:tcMar>
+              <w:top w:w="80" w:type="dxa"/>
+              <w:left w:w="120" w:type="dxa"/>
+              <w:bottom w:w="80" w:type="dxa"/>
+              <w:right w:w="120" w:type="dxa"/>
+            </w:tcMar>
+          </w:tcPr>
+          <w:p>
+            <w:r>
+              <w:rPr>
+                <w:sz w:val="15"/>
+                <w:szCs w:val="15"/>
+              </w:rPr>
+              <w:t xml:space="preserve">AI-assisted rapid prototyping for functional tools, scripts, and apps. Optimized for speed-to-working-artifact. Useful for one-off data transforms, scrapers, and automation.</w:t>
+            </w:r>
+          </w:p>
+        </w:tc>
+        <w:tc>
+          <w:tcPr>
+            <w:tcW w:w="3000" w:type="dxa"/>
+            <w:tcBorders>
+              <w:top w:val="single" w:sz="4" w:space="0" w:color="DDDDDD"/>
+              <w:left w:val="single" w:sz="4" w:space="0" w:color="DDDDDD"/>
+              <w:bottom w:val="single" w:sz="4" w:space="0" w:color="DDDDDD"/>
+              <w:right w:val="single" w:sz="4" w:space="0" w:color="DDDDDD"/>
+            </w:tcBorders>
+            <w:shd w:val="clear" w:color="auto" w:fill="F2F2F2"/>
+            <w:tcMar>
+              <w:top w:w="80" w:type="dxa"/>
+              <w:left w:w="120" w:type="dxa"/>
+              <w:bottom w:w="80" w:type="dxa"/>
+              <w:right w:w="120" w:type="dxa"/>
+            </w:tcMar>
+          </w:tcPr>
+          <w:p>
+            <w:r>
+              <w:rPr>
+                <w:sz w:val="15"/>
+                <w:szCs w:val="15"/>
+              </w:rPr>
+              <w:t xml:space="preserve">None — standalone</w:t>
+            </w:r>
+          </w:p>
+        </w:tc>
+      </w:tr>
+      <w:tr>
+        <w:tc>
+          <w:tcPr>
+            <w:tcW w:w="1200" w:type="dxa"/>
+            <w:tcBorders>
+              <w:top w:val="single" w:sz="4" w:space="0" w:color="DDDDDD"/>
+              <w:left w:val="single" w:sz="4" w:space="0" w:color="DDDDDD"/>
+              <w:bottom w:val="single" w:sz="4" w:space="0" w:color="DDDDDD"/>
+              <w:right w:val="single" w:sz="4" w:space="0" w:color="DDDDDD"/>
+            </w:tcBorders>
+            <w:shd w:val="clear" w:color="auto" w:fill="F2F2F2"/>
+            <w:tcMar>
+              <w:top w:w="80" w:type="dxa"/>
+              <w:left w:w="120" w:type="dxa"/>
+              <w:bottom w:w="80" w:type="dxa"/>
+              <w:right w:w="120" w:type="dxa"/>
+            </w:tcMar>
+          </w:tcPr>
+          <w:p>
+            <w:r>
+              <w:rPr>
+                <w:sz w:val="15"/>
+                <w:szCs w:val="15"/>
+              </w:rPr>
+              <w:t xml:space="preserve">6 -- Utility</w:t>
+            </w:r>
+          </w:p>
+        </w:tc>
+        <w:tc>
+          <w:tcPr>
+            <w:tcW w:w="2400" w:type="dxa"/>
+            <w:tcBorders>
+              <w:top w:val="single" w:sz="4" w:space="0" w:color="DDDDDD"/>
+              <w:left w:val="single" w:sz="4" w:space="0" w:color="DDDDDD"/>
+              <w:bottom w:val="single" w:sz="4" w:space="0" w:color="DDDDDD"/>
+              <w:right w:val="single" w:sz="4" w:space="0" w:color="DDDDDD"/>
+            </w:tcBorders>
+            <w:shd w:val="clear" w:color="auto" w:fill="F2F2F2"/>
+            <w:tcMar>
+              <w:top w:w="80" w:type="dxa"/>
+              <w:left w:w="120" w:type="dxa"/>
+              <w:bottom w:w="80" w:type="dxa"/>
+              <w:right w:w="120" w:type="dxa"/>
+            </w:tcMar>
+          </w:tcPr>
+          <w:p>
+            <w:r>
+              <w:rPr>
+                <w:sz w:val="15"/>
+                <w:szCs w:val="15"/>
+              </w:rPr>
+              <w:t xml:space="preserve">skill-authoring-workflow</w:t>
+            </w:r>
+          </w:p>
+        </w:tc>
+        <w:tc>
+          <w:tcPr>
+            <w:tcW w:w="4200" w:type="dxa"/>
+            <w:tcBorders>
+              <w:top w:val="single" w:sz="4" w:space="0" w:color="DDDDDD"/>
+              <w:left w:val="single" w:sz="4" w:space="0" w:color="DDDDDD"/>
+              <w:bottom w:val="single" w:sz="4" w:space="0" w:color="DDDDDD"/>
+              <w:right w:val="single" w:sz="4" w:space="0" w:color="DDDDDD"/>
+            </w:tcBorders>
+            <w:shd w:val="clear" w:color="auto" w:fill="F2F2F2"/>
+            <w:tcMar>
+              <w:top w:w="80" w:type="dxa"/>
+              <w:left w:w="120" w:type="dxa"/>
+              <w:bottom w:w="80" w:type="dxa"/>
+              <w:right w:w="120" w:type="dxa"/>
+            </w:tcMar>
+          </w:tcPr>
+          <w:p>
+            <w:r>
+              <w:rPr>
+                <w:sz w:val="15"/>
+                <w:szCs w:val="15"/>
+              </w:rPr>
+              <w:t xml:space="preserve">Standards and process for creating or updating a skill. Covers SKILL.md structure, trigger language, integration rules, quality checks, and README/agents.md updates.</w:t>
+            </w:r>
+          </w:p>
+        </w:tc>
+        <w:tc>
+          <w:tcPr>
+            <w:tcW w:w="3000" w:type="dxa"/>
+            <w:tcBorders>
+              <w:top w:val="single" w:sz="4" w:space="0" w:color="DDDDDD"/>
+              <w:left w:val="single" w:sz="4" w:space="0" w:color="DDDDDD"/>
+              <w:bottom w:val="single" w:sz="4" w:space="0" w:color="DDDDDD"/>
+              <w:right w:val="single" w:sz="4" w:space="0" w:color="DDDDDD"/>
+            </w:tcBorders>
+            <w:shd w:val="clear" w:color="auto" w:fill="F2F2F2"/>
+            <w:tcMar>
+              <w:top w:w="80" w:type="dxa"/>
+              <w:left w:w="120" w:type="dxa"/>
+              <w:bottom w:w="80" w:type="dxa"/>
+              <w:right w:w="120" w:type="dxa"/>
+            </w:tcMar>
+          </w:tcPr>
+          <w:p>
+            <w:r>
+              <w:rPr>
+                <w:sz w:val="15"/>
+                <w:szCs w:val="15"/>
+              </w:rPr>
+              <w:t xml:space="preserve">None — meta-skill</w:t>
+            </w:r>
+          </w:p>
+        </w:tc>
+      </w:tr>
+      <w:tr>
+        <w:tc>
+          <w:tcPr>
+            <w:tcW w:w="1200" w:type="dxa"/>
+            <w:tcBorders>
+              <w:top w:val="single" w:sz="4" w:space="0" w:color="DDDDDD"/>
+              <w:left w:val="single" w:sz="4" w:space="0" w:color="DDDDDD"/>
+              <w:bottom w:val="single" w:sz="4" w:space="0" w:color="DDDDDD"/>
+              <w:right w:val="single" w:sz="4" w:space="0" w:color="DDDDDD"/>
+            </w:tcBorders>
+            <w:shd w:val="clear" w:color="auto" w:fill="F2F2F2"/>
+            <w:tcMar>
+              <w:top w:w="80" w:type="dxa"/>
+              <w:left w:w="120" w:type="dxa"/>
+              <w:bottom w:w="80" w:type="dxa"/>
+              <w:right w:w="120" w:type="dxa"/>
+            </w:tcMar>
+          </w:tcPr>
+          <w:p>
+            <w:r>
+              <w:rPr>
+                <w:sz w:val="15"/>
+                <w:szCs w:val="15"/>
+              </w:rPr>
+              <w:t xml:space="preserve">4 -- Production</w:t>
+            </w:r>
+          </w:p>
+        </w:tc>
+        <w:tc>
+          <w:tcPr>
+            <w:tcW w:w="2400" w:type="dxa"/>
+            <w:tcBorders>
+              <w:top w:val="single" w:sz="4" w:space="0" w:color="DDDDDD"/>
+              <w:left w:val="single" w:sz="4" w:space="0" w:color="DDDDDD"/>
+              <w:bottom w:val="single" w:sz="4" w:space="0" w:color="DDDDDD"/>
+              <w:right w:val="single" w:sz="4" w:space="0" w:color="DDDDDD"/>
+            </w:tcBorders>
+            <w:shd w:val="clear" w:color="auto" w:fill="F2F2F2"/>
+            <w:tcMar>
+              <w:top w:w="80" w:type="dxa"/>
+              <w:left w:w="120" w:type="dxa"/>
+              <w:bottom w:w="80" w:type="dxa"/>
+              <w:right w:w="120" w:type="dxa"/>
+            </w:tcMar>
+          </w:tcPr>
+          <w:p>
+            <w:r>
+              <w:rPr>
+                <w:sz w:val="15"/>
+                <w:szCs w:val="15"/>
+              </w:rPr>
+              <w:t xml:space="preserve">deal-workbook-builder</w:t>
+            </w:r>
+          </w:p>
+        </w:tc>
+        <w:tc>
+          <w:tcPr>
+            <w:tcW w:w="4200" w:type="dxa"/>
+            <w:tcBorders>
+              <w:top w:val="single" w:sz="4" w:space="0" w:color="DDDDDD"/>
+              <w:left w:val="single" w:sz="4" w:space="0" w:color="DDDDDD"/>
+              <w:bottom w:val="single" w:sz="4" w:space="0" w:color="DDDDDD"/>
+              <w:right w:val="single" w:sz="4" w:space="0" w:color="DDDDDD"/>
+            </w:tcBorders>
+            <w:shd w:val="clear" w:color="auto" w:fill="F2F2F2"/>
+            <w:tcMar>
+              <w:top w:w="80" w:type="dxa"/>
+              <w:left w:w="120" w:type="dxa"/>
+              <w:bottom w:w="80" w:type="dxa"/>
+              <w:right w:w="120" w:type="dxa"/>
+            </w:tcMar>
+          </w:tcPr>
+          <w:p>
+            <w:r>
+              <w:rPr>
+                <w:sz w:val="15"/>
+                <w:szCs w:val="15"/>
+              </w:rPr>
+              <w:t xml:space="preserve">Builds and maintains the PE/M&amp;A deal workbook: formula-linked Driver Tree, KPI Tree, NTB Registry, and MOIC Bridge tabs chained to the FINANCIAL MODEL. Variance columns smart-formatted (ppt for margins, % for volumes). Automated quality checks after every build.</w:t>
+            </w:r>
+          </w:p>
+        </w:tc>
+        <w:tc>
+          <w:tcPr>
+            <w:tcW w:w="3000" w:type="dxa"/>
+            <w:tcBorders>
+              <w:top w:val="single" w:sz="4" w:space="0" w:color="DDDDDD"/>
+              <w:left w:val="single" w:sz="4" w:space="0" w:color="DDDDDD"/>
+              <w:bottom w:val="single" w:sz="4" w:space="0" w:color="DDDDDD"/>
+              <w:right w:val="single" w:sz="4" w:space="0" w:color="DDDDDD"/>
+            </w:tcBorders>
+            <w:shd w:val="clear" w:color="auto" w:fill="F2F2F2"/>
+            <w:tcMar>
+              <w:top w:w="80" w:type="dxa"/>
+              <w:left w:w="120" w:type="dxa"/>
+              <w:bottom w:w="80" w:type="dxa"/>
+              <w:right w:w="120" w:type="dxa"/>
+            </w:tcMar>
+          </w:tcPr>
+          <w:p>
+            <w:r>
+              <w:rPr>
+                <w:sz w:val="15"/>
+                <w:szCs w:val="15"/>
+              </w:rPr>
+              <w:t xml:space="preserve">financial-model-builder, driver-tree, kpi-tree-builder, ntb-diligence</w:t>
             </w:r>
           </w:p>
         </w:tc>
@@ -16874,7 +17644,7 @@
           <w:rFonts w:ascii="Wix Madefor Display SemiBold" w:eastAsia="Wix Madefor Display SemiBold" w:hAnsi="Wix Madefor Display SemiBold" w:cs="Wix Madefor Display SemiBold"/>
           <w:color w:val="3A00FD"/>
         </w:rPr>
-        <w:t>8.1 Domain Templates (April 2026)</w:t>
+        <w:t>8.1 Domain Templates (May 2026)</w:t>
       </w:r>
     </w:p>
     <w:p>

</xml_diff>

<commit_message>
Add new deal gold standard workflow
</commit_message>
<xml_diff>
--- a/docs/Claude_Skill_Library_External (Finance)_v6.docx
+++ b/docs/Claude_Skill_Library_External (Finance)_v6.docx
@@ -1798,271 +1798,7 @@
                 <w:color w:val="000000"/>
                 <w:sz w:val="16"/>
               </w:rPr>
-              <w:t>financial-model-builder</w:t>
-            </w:r>
-          </w:p>
-        </w:tc>
-        <w:tc>
-          <w:tcPr>
-            <w:tcW w:type="dxa" w:w="1700"/>
-            <w:tcBorders>
-              <w:top w:val="single" w:sz="4" w:space="0" w:color="DDDDDD"/>
-              <w:left w:val="single" w:sz="4" w:space="0" w:color="DDDDDD"/>
-              <w:bottom w:val="single" w:sz="4" w:space="0" w:color="DDDDDD"/>
-              <w:right w:val="single" w:sz="4" w:space="0" w:color="DDDDDD"/>
-            </w:tcBorders>
-            <w:tcMar>
-              <w:top w:w="80" w:type="dxa"/>
-              <w:left w:w="120" w:type="dxa"/>
-              <w:bottom w:w="80" w:type="dxa"/>
-              <w:right w:w="120" w:type="dxa"/>
-            </w:tcMar>
-            <w:shd w:fill="F5F8FF"/>
-            <w:vAlign w:val="center"/>
-          </w:tcPr>
-          <w:p>
-            <w:pPr>
-              <w:spacing w:after="0"/>
-            </w:pPr>
-            <w:r>
-              <w:rPr>
-                <w:rFonts w:ascii="Wix Madefor Display" w:hAnsi="Wix Madefor Display" w:eastAsia="Wix Madefor Display"/>
-                <w:b w:val="0"/>
-                <w:color w:val="000000"/>
-                <w:sz w:val="16"/>
-              </w:rPr>
-              <w:t>Foundation</w:t>
-            </w:r>
-          </w:p>
-        </w:tc>
-        <w:tc>
-          <w:tcPr>
-            <w:tcW w:type="dxa" w:w="4500"/>
-            <w:tcBorders>
-              <w:top w:val="single" w:sz="4" w:space="0" w:color="DDDDDD"/>
-              <w:left w:val="single" w:sz="4" w:space="0" w:color="DDDDDD"/>
-              <w:bottom w:val="single" w:sz="4" w:space="0" w:color="DDDDDD"/>
-              <w:right w:val="single" w:sz="4" w:space="0" w:color="DDDDDD"/>
-            </w:tcBorders>
-            <w:tcMar>
-              <w:top w:w="80" w:type="dxa"/>
-              <w:left w:w="120" w:type="dxa"/>
-              <w:bottom w:w="80" w:type="dxa"/>
-              <w:right w:w="120" w:type="dxa"/>
-            </w:tcMar>
-            <w:shd w:fill="F5F8FF"/>
-            <w:vAlign w:val="center"/>
-          </w:tcPr>
-          <w:p>
-            <w:pPr>
-              <w:spacing w:after="0"/>
-            </w:pPr>
-            <w:r>
-              <w:rPr>
-                <w:rFonts w:ascii="Wix Madefor Display" w:hAnsi="Wix Madefor Display" w:eastAsia="Wix Madefor Display"/>
-                <w:b w:val="0"/>
-                <w:color w:val="000000"/>
-                <w:sz w:val="16"/>
-              </w:rPr>
-              <w:t>Builds canonical Input Page, Financial Model Template, and Output Tab from source P&amp;L/BS.</w:t>
-            </w:r>
-          </w:p>
-        </w:tc>
-        <w:tc>
-          <w:tcPr>
-            <w:tcW w:type="dxa" w:w="2300"/>
-            <w:tcBorders>
-              <w:top w:val="single" w:sz="4" w:space="0" w:color="DDDDDD"/>
-              <w:left w:val="single" w:sz="4" w:space="0" w:color="DDDDDD"/>
-              <w:bottom w:val="single" w:sz="4" w:space="0" w:color="DDDDDD"/>
-              <w:right w:val="single" w:sz="4" w:space="0" w:color="DDDDDD"/>
-            </w:tcBorders>
-            <w:tcMar>
-              <w:top w:w="80" w:type="dxa"/>
-              <w:left w:w="120" w:type="dxa"/>
-              <w:bottom w:w="80" w:type="dxa"/>
-              <w:right w:w="120" w:type="dxa"/>
-            </w:tcMar>
-            <w:shd w:fill="F5F8FF"/>
-            <w:vAlign w:val="center"/>
-          </w:tcPr>
-          <w:p>
-            <w:pPr>
-              <w:spacing w:after="0"/>
-            </w:pPr>
-            <w:r>
-              <w:rPr>
-                <w:rFonts w:ascii="Wix Madefor Display" w:hAnsi="Wix Madefor Display" w:eastAsia="Wix Madefor Display"/>
-                <w:b w:val="0"/>
-                <w:color w:val="000000"/>
-                <w:sz w:val="16"/>
-              </w:rPr>
-              <w:t>Load first before downstream finance skills.</w:t>
-            </w:r>
-          </w:p>
-        </w:tc>
-      </w:tr>
-      <w:tr>
-        <w:tc>
-          <w:tcPr>
-            <w:tcW w:type="dxa" w:w="2300"/>
-            <w:tcBorders>
-              <w:top w:val="single" w:sz="4" w:space="0" w:color="DDDDDD"/>
-              <w:left w:val="single" w:sz="4" w:space="0" w:color="DDDDDD"/>
-              <w:bottom w:val="single" w:sz="4" w:space="0" w:color="DDDDDD"/>
-              <w:right w:val="single" w:sz="4" w:space="0" w:color="DDDDDD"/>
-            </w:tcBorders>
-            <w:tcMar>
-              <w:top w:w="80" w:type="dxa"/>
-              <w:left w:w="120" w:type="dxa"/>
-              <w:bottom w:w="80" w:type="dxa"/>
-              <w:right w:w="120" w:type="dxa"/>
-            </w:tcMar>
-            <w:vAlign w:val="center"/>
-          </w:tcPr>
-          <w:p>
-            <w:pPr>
-              <w:spacing w:after="0"/>
-            </w:pPr>
-            <w:r>
-              <w:rPr>
-                <w:rFonts w:ascii="Wix Madefor Display" w:hAnsi="Wix Madefor Display" w:eastAsia="Wix Madefor Display"/>
-                <w:b w:val="0"/>
-                <w:color w:val="000000"/>
-                <w:sz w:val="16"/>
-              </w:rPr>
-              <w:t>ic-memo</w:t>
-            </w:r>
-          </w:p>
-        </w:tc>
-        <w:tc>
-          <w:tcPr>
-            <w:tcW w:type="dxa" w:w="1700"/>
-            <w:tcBorders>
-              <w:top w:val="single" w:sz="4" w:space="0" w:color="DDDDDD"/>
-              <w:left w:val="single" w:sz="4" w:space="0" w:color="DDDDDD"/>
-              <w:bottom w:val="single" w:sz="4" w:space="0" w:color="DDDDDD"/>
-              <w:right w:val="single" w:sz="4" w:space="0" w:color="DDDDDD"/>
-            </w:tcBorders>
-            <w:tcMar>
-              <w:top w:w="80" w:type="dxa"/>
-              <w:left w:w="120" w:type="dxa"/>
-              <w:bottom w:w="80" w:type="dxa"/>
-              <w:right w:w="120" w:type="dxa"/>
-            </w:tcMar>
-            <w:vAlign w:val="center"/>
-          </w:tcPr>
-          <w:p>
-            <w:pPr>
-              <w:spacing w:after="0"/>
-            </w:pPr>
-            <w:r>
-              <w:rPr>
-                <w:rFonts w:ascii="Wix Madefor Display" w:hAnsi="Wix Madefor Display" w:eastAsia="Wix Madefor Display"/>
-                <w:b w:val="0"/>
-                <w:color w:val="000000"/>
-                <w:sz w:val="16"/>
-              </w:rPr>
-              <w:t>Investment memo</w:t>
-            </w:r>
-          </w:p>
-        </w:tc>
-        <w:tc>
-          <w:tcPr>
-            <w:tcW w:type="dxa" w:w="4500"/>
-            <w:tcBorders>
-              <w:top w:val="single" w:sz="4" w:space="0" w:color="DDDDDD"/>
-              <w:left w:val="single" w:sz="4" w:space="0" w:color="DDDDDD"/>
-              <w:bottom w:val="single" w:sz="4" w:space="0" w:color="DDDDDD"/>
-              <w:right w:val="single" w:sz="4" w:space="0" w:color="DDDDDD"/>
-            </w:tcBorders>
-            <w:tcMar>
-              <w:top w:w="80" w:type="dxa"/>
-              <w:left w:w="120" w:type="dxa"/>
-              <w:bottom w:w="80" w:type="dxa"/>
-              <w:right w:w="120" w:type="dxa"/>
-            </w:tcMar>
-            <w:vAlign w:val="center"/>
-          </w:tcPr>
-          <w:p>
-            <w:pPr>
-              <w:spacing w:after="0"/>
-            </w:pPr>
-            <w:r>
-              <w:rPr>
-                <w:rFonts w:ascii="Wix Madefor Display" w:hAnsi="Wix Madefor Display" w:eastAsia="Wix Madefor Display"/>
-                <w:b w:val="0"/>
-                <w:color w:val="000000"/>
-                <w:sz w:val="16"/>
-              </w:rPr>
-              <w:t>Creates three-gate IC memo structure with company quality, sector timing, investment attractiveness, kill criteria.</w:t>
-            </w:r>
-          </w:p>
-        </w:tc>
-        <w:tc>
-          <w:tcPr>
-            <w:tcW w:type="dxa" w:w="2300"/>
-            <w:tcBorders>
-              <w:top w:val="single" w:sz="4" w:space="0" w:color="DDDDDD"/>
-              <w:left w:val="single" w:sz="4" w:space="0" w:color="DDDDDD"/>
-              <w:bottom w:val="single" w:sz="4" w:space="0" w:color="DDDDDD"/>
-              <w:right w:val="single" w:sz="4" w:space="0" w:color="DDDDDD"/>
-            </w:tcBorders>
-            <w:tcMar>
-              <w:top w:w="80" w:type="dxa"/>
-              <w:left w:w="120" w:type="dxa"/>
-              <w:bottom w:w="80" w:type="dxa"/>
-              <w:right w:w="120" w:type="dxa"/>
-            </w:tcMar>
-            <w:vAlign w:val="center"/>
-          </w:tcPr>
-          <w:p>
-            <w:pPr>
-              <w:spacing w:after="0"/>
-            </w:pPr>
-            <w:r>
-              <w:rPr>
-                <w:rFonts w:ascii="Wix Madefor Display" w:hAnsi="Wix Madefor Display" w:eastAsia="Wix Madefor Display"/>
-                <w:b w:val="0"/>
-                <w:color w:val="000000"/>
-                <w:sz w:val="16"/>
-              </w:rPr>
-              <w:t>Use for standalone memo; pipeline for full workflow.</w:t>
-            </w:r>
-          </w:p>
-        </w:tc>
-      </w:tr>
-      <w:tr>
-        <w:tc>
-          <w:tcPr>
-            <w:tcW w:type="dxa" w:w="2300"/>
-            <w:tcBorders>
-              <w:top w:val="single" w:sz="4" w:space="0" w:color="DDDDDD"/>
-              <w:left w:val="single" w:sz="4" w:space="0" w:color="DDDDDD"/>
-              <w:bottom w:val="single" w:sz="4" w:space="0" w:color="DDDDDD"/>
-              <w:right w:val="single" w:sz="4" w:space="0" w:color="DDDDDD"/>
-            </w:tcBorders>
-            <w:tcMar>
-              <w:top w:w="80" w:type="dxa"/>
-              <w:left w:w="120" w:type="dxa"/>
-              <w:bottom w:w="80" w:type="dxa"/>
-              <w:right w:w="120" w:type="dxa"/>
-            </w:tcMar>
-            <w:shd w:fill="F5F8FF"/>
-            <w:vAlign w:val="center"/>
-          </w:tcPr>
-          <w:p>
-            <w:pPr>
-              <w:spacing w:after="0"/>
-            </w:pPr>
-            <w:r>
-              <w:rPr>
-                <w:rFonts w:ascii="Wix Madefor Display" w:hAnsi="Wix Madefor Display" w:eastAsia="Wix Madefor Display"/>
-                <w:b w:val="0"/>
-                <w:color w:val="000000"/>
-                <w:sz w:val="16"/>
-              </w:rPr>
-              <w:t>ic-memo-pipeline</w:t>
+              <w:t>new-deal-pipeline</w:t>
             </w:r>
           </w:p>
         </w:tc>
@@ -2128,6 +1864,401 @@
                 <w:color w:val="000000"/>
                 <w:sz w:val="16"/>
               </w:rPr>
+              <w:t>Runs gold-standard market research, competitive assessment, diligence bridge, IC memo, and cross-output QA.</w:t>
+            </w:r>
+          </w:p>
+        </w:tc>
+        <w:tc>
+          <w:tcPr>
+            <w:tcW w:type="dxa" w:w="2300"/>
+            <w:tcBorders>
+              <w:top w:val="single" w:sz="4" w:space="0" w:color="DDDDDD"/>
+              <w:left w:val="single" w:sz="4" w:space="0" w:color="DDDDDD"/>
+              <w:bottom w:val="single" w:sz="4" w:space="0" w:color="DDDDDD"/>
+              <w:right w:val="single" w:sz="4" w:space="0" w:color="DDDDDD"/>
+            </w:tcBorders>
+            <w:tcMar>
+              <w:top w:w="80" w:type="dxa"/>
+              <w:left w:w="120" w:type="dxa"/>
+              <w:bottom w:w="80" w:type="dxa"/>
+              <w:right w:w="120" w:type="dxa"/>
+            </w:tcMar>
+            <w:shd w:fill="F5F8FF"/>
+            <w:vAlign w:val="center"/>
+          </w:tcPr>
+          <w:p>
+            <w:pPr>
+              <w:spacing w:after="0"/>
+            </w:pPr>
+            <w:r>
+              <w:rPr>
+                <w:rFonts w:ascii="Wix Madefor Display" w:hAnsi="Wix Madefor Display" w:eastAsia="Wix Madefor Display"/>
+                <w:b w:val="0"/>
+                <w:color w:val="000000"/>
+                <w:sz w:val="16"/>
+              </w:rPr>
+              <w:t>Best for new deals requiring a full evidence-backed deal pack.</w:t>
+            </w:r>
+          </w:p>
+        </w:tc>
+      </w:tr>
+      <w:tr>
+        <w:tc>
+          <w:tcPr>
+            <w:tcW w:type="dxa" w:w="2300"/>
+            <w:tcBorders>
+              <w:top w:val="single" w:sz="4" w:space="0" w:color="DDDDDD"/>
+              <w:left w:val="single" w:sz="4" w:space="0" w:color="DDDDDD"/>
+              <w:bottom w:val="single" w:sz="4" w:space="0" w:color="DDDDDD"/>
+              <w:right w:val="single" w:sz="4" w:space="0" w:color="DDDDDD"/>
+            </w:tcBorders>
+            <w:tcMar>
+              <w:top w:w="80" w:type="dxa"/>
+              <w:left w:w="120" w:type="dxa"/>
+              <w:bottom w:w="80" w:type="dxa"/>
+              <w:right w:w="120" w:type="dxa"/>
+            </w:tcMar>
+            <w:vAlign w:val="center"/>
+          </w:tcPr>
+          <w:p>
+            <w:pPr>
+              <w:spacing w:after="0"/>
+            </w:pPr>
+            <w:r>
+              <w:rPr>
+                <w:rFonts w:ascii="Wix Madefor Display" w:hAnsi="Wix Madefor Display" w:eastAsia="Wix Madefor Display"/>
+                <w:b w:val="0"/>
+                <w:color w:val="000000"/>
+                <w:sz w:val="16"/>
+              </w:rPr>
+              <w:t>financial-model-builder</w:t>
+            </w:r>
+          </w:p>
+        </w:tc>
+        <w:tc>
+          <w:tcPr>
+            <w:tcW w:type="dxa" w:w="1700"/>
+            <w:tcBorders>
+              <w:top w:val="single" w:sz="4" w:space="0" w:color="DDDDDD"/>
+              <w:left w:val="single" w:sz="4" w:space="0" w:color="DDDDDD"/>
+              <w:bottom w:val="single" w:sz="4" w:space="0" w:color="DDDDDD"/>
+              <w:right w:val="single" w:sz="4" w:space="0" w:color="DDDDDD"/>
+            </w:tcBorders>
+            <w:tcMar>
+              <w:top w:w="80" w:type="dxa"/>
+              <w:left w:w="120" w:type="dxa"/>
+              <w:bottom w:w="80" w:type="dxa"/>
+              <w:right w:w="120" w:type="dxa"/>
+            </w:tcMar>
+            <w:vAlign w:val="center"/>
+          </w:tcPr>
+          <w:p>
+            <w:pPr>
+              <w:spacing w:after="0"/>
+            </w:pPr>
+            <w:r>
+              <w:rPr>
+                <w:rFonts w:ascii="Wix Madefor Display" w:hAnsi="Wix Madefor Display" w:eastAsia="Wix Madefor Display"/>
+                <w:b w:val="0"/>
+                <w:color w:val="000000"/>
+                <w:sz w:val="16"/>
+              </w:rPr>
+              <w:t>Foundation</w:t>
+            </w:r>
+          </w:p>
+        </w:tc>
+        <w:tc>
+          <w:tcPr>
+            <w:tcW w:type="dxa" w:w="4500"/>
+            <w:tcBorders>
+              <w:top w:val="single" w:sz="4" w:space="0" w:color="DDDDDD"/>
+              <w:left w:val="single" w:sz="4" w:space="0" w:color="DDDDDD"/>
+              <w:bottom w:val="single" w:sz="4" w:space="0" w:color="DDDDDD"/>
+              <w:right w:val="single" w:sz="4" w:space="0" w:color="DDDDDD"/>
+            </w:tcBorders>
+            <w:tcMar>
+              <w:top w:w="80" w:type="dxa"/>
+              <w:left w:w="120" w:type="dxa"/>
+              <w:bottom w:w="80" w:type="dxa"/>
+              <w:right w:w="120" w:type="dxa"/>
+            </w:tcMar>
+            <w:vAlign w:val="center"/>
+          </w:tcPr>
+          <w:p>
+            <w:pPr>
+              <w:spacing w:after="0"/>
+            </w:pPr>
+            <w:r>
+              <w:rPr>
+                <w:rFonts w:ascii="Wix Madefor Display" w:hAnsi="Wix Madefor Display" w:eastAsia="Wix Madefor Display"/>
+                <w:b w:val="0"/>
+                <w:color w:val="000000"/>
+                <w:sz w:val="16"/>
+              </w:rPr>
+              <w:t>Builds canonical Input Page, Financial Model Template, and Output Tab from source P&amp;L/BS.</w:t>
+            </w:r>
+          </w:p>
+        </w:tc>
+        <w:tc>
+          <w:tcPr>
+            <w:tcW w:type="dxa" w:w="2300"/>
+            <w:tcBorders>
+              <w:top w:val="single" w:sz="4" w:space="0" w:color="DDDDDD"/>
+              <w:left w:val="single" w:sz="4" w:space="0" w:color="DDDDDD"/>
+              <w:bottom w:val="single" w:sz="4" w:space="0" w:color="DDDDDD"/>
+              <w:right w:val="single" w:sz="4" w:space="0" w:color="DDDDDD"/>
+            </w:tcBorders>
+            <w:tcMar>
+              <w:top w:w="80" w:type="dxa"/>
+              <w:left w:w="120" w:type="dxa"/>
+              <w:bottom w:w="80" w:type="dxa"/>
+              <w:right w:w="120" w:type="dxa"/>
+            </w:tcMar>
+            <w:vAlign w:val="center"/>
+          </w:tcPr>
+          <w:p>
+            <w:pPr>
+              <w:spacing w:after="0"/>
+            </w:pPr>
+            <w:r>
+              <w:rPr>
+                <w:rFonts w:ascii="Wix Madefor Display" w:hAnsi="Wix Madefor Display" w:eastAsia="Wix Madefor Display"/>
+                <w:b w:val="0"/>
+                <w:color w:val="000000"/>
+                <w:sz w:val="16"/>
+              </w:rPr>
+              <w:t>Load first before downstream finance skills.</w:t>
+            </w:r>
+          </w:p>
+        </w:tc>
+      </w:tr>
+      <w:tr>
+        <w:tc>
+          <w:tcPr>
+            <w:tcW w:type="dxa" w:w="2300"/>
+            <w:tcBorders>
+              <w:top w:val="single" w:sz="4" w:space="0" w:color="DDDDDD"/>
+              <w:left w:val="single" w:sz="4" w:space="0" w:color="DDDDDD"/>
+              <w:bottom w:val="single" w:sz="4" w:space="0" w:color="DDDDDD"/>
+              <w:right w:val="single" w:sz="4" w:space="0" w:color="DDDDDD"/>
+            </w:tcBorders>
+            <w:tcMar>
+              <w:top w:w="80" w:type="dxa"/>
+              <w:left w:w="120" w:type="dxa"/>
+              <w:bottom w:w="80" w:type="dxa"/>
+              <w:right w:w="120" w:type="dxa"/>
+            </w:tcMar>
+            <w:shd w:fill="F5F8FF"/>
+            <w:vAlign w:val="center"/>
+          </w:tcPr>
+          <w:p>
+            <w:pPr>
+              <w:spacing w:after="0"/>
+            </w:pPr>
+            <w:r>
+              <w:rPr>
+                <w:rFonts w:ascii="Wix Madefor Display" w:hAnsi="Wix Madefor Display" w:eastAsia="Wix Madefor Display"/>
+                <w:b w:val="0"/>
+                <w:color w:val="000000"/>
+                <w:sz w:val="16"/>
+              </w:rPr>
+              <w:t>ic-memo</w:t>
+            </w:r>
+          </w:p>
+        </w:tc>
+        <w:tc>
+          <w:tcPr>
+            <w:tcW w:type="dxa" w:w="1700"/>
+            <w:tcBorders>
+              <w:top w:val="single" w:sz="4" w:space="0" w:color="DDDDDD"/>
+              <w:left w:val="single" w:sz="4" w:space="0" w:color="DDDDDD"/>
+              <w:bottom w:val="single" w:sz="4" w:space="0" w:color="DDDDDD"/>
+              <w:right w:val="single" w:sz="4" w:space="0" w:color="DDDDDD"/>
+            </w:tcBorders>
+            <w:tcMar>
+              <w:top w:w="80" w:type="dxa"/>
+              <w:left w:w="120" w:type="dxa"/>
+              <w:bottom w:w="80" w:type="dxa"/>
+              <w:right w:w="120" w:type="dxa"/>
+            </w:tcMar>
+            <w:shd w:fill="F5F8FF"/>
+            <w:vAlign w:val="center"/>
+          </w:tcPr>
+          <w:p>
+            <w:pPr>
+              <w:spacing w:after="0"/>
+            </w:pPr>
+            <w:r>
+              <w:rPr>
+                <w:rFonts w:ascii="Wix Madefor Display" w:hAnsi="Wix Madefor Display" w:eastAsia="Wix Madefor Display"/>
+                <w:b w:val="0"/>
+                <w:color w:val="000000"/>
+                <w:sz w:val="16"/>
+              </w:rPr>
+              <w:t>Investment memo</w:t>
+            </w:r>
+          </w:p>
+        </w:tc>
+        <w:tc>
+          <w:tcPr>
+            <w:tcW w:type="dxa" w:w="4500"/>
+            <w:tcBorders>
+              <w:top w:val="single" w:sz="4" w:space="0" w:color="DDDDDD"/>
+              <w:left w:val="single" w:sz="4" w:space="0" w:color="DDDDDD"/>
+              <w:bottom w:val="single" w:sz="4" w:space="0" w:color="DDDDDD"/>
+              <w:right w:val="single" w:sz="4" w:space="0" w:color="DDDDDD"/>
+            </w:tcBorders>
+            <w:tcMar>
+              <w:top w:w="80" w:type="dxa"/>
+              <w:left w:w="120" w:type="dxa"/>
+              <w:bottom w:w="80" w:type="dxa"/>
+              <w:right w:w="120" w:type="dxa"/>
+            </w:tcMar>
+            <w:shd w:fill="F5F8FF"/>
+            <w:vAlign w:val="center"/>
+          </w:tcPr>
+          <w:p>
+            <w:pPr>
+              <w:spacing w:after="0"/>
+            </w:pPr>
+            <w:r>
+              <w:rPr>
+                <w:rFonts w:ascii="Wix Madefor Display" w:hAnsi="Wix Madefor Display" w:eastAsia="Wix Madefor Display"/>
+                <w:b w:val="0"/>
+                <w:color w:val="000000"/>
+                <w:sz w:val="16"/>
+              </w:rPr>
+              <w:t>Creates three-gate IC memo structure with company quality, sector timing, investment attractiveness, kill criteria.</w:t>
+            </w:r>
+          </w:p>
+        </w:tc>
+        <w:tc>
+          <w:tcPr>
+            <w:tcW w:type="dxa" w:w="2300"/>
+            <w:tcBorders>
+              <w:top w:val="single" w:sz="4" w:space="0" w:color="DDDDDD"/>
+              <w:left w:val="single" w:sz="4" w:space="0" w:color="DDDDDD"/>
+              <w:bottom w:val="single" w:sz="4" w:space="0" w:color="DDDDDD"/>
+              <w:right w:val="single" w:sz="4" w:space="0" w:color="DDDDDD"/>
+            </w:tcBorders>
+            <w:tcMar>
+              <w:top w:w="80" w:type="dxa"/>
+              <w:left w:w="120" w:type="dxa"/>
+              <w:bottom w:w="80" w:type="dxa"/>
+              <w:right w:w="120" w:type="dxa"/>
+            </w:tcMar>
+            <w:shd w:fill="F5F8FF"/>
+            <w:vAlign w:val="center"/>
+          </w:tcPr>
+          <w:p>
+            <w:pPr>
+              <w:spacing w:after="0"/>
+            </w:pPr>
+            <w:r>
+              <w:rPr>
+                <w:rFonts w:ascii="Wix Madefor Display" w:hAnsi="Wix Madefor Display" w:eastAsia="Wix Madefor Display"/>
+                <w:b w:val="0"/>
+                <w:color w:val="000000"/>
+                <w:sz w:val="16"/>
+              </w:rPr>
+              <w:t>Use for standalone memo; pipeline for full workflow.</w:t>
+            </w:r>
+          </w:p>
+        </w:tc>
+      </w:tr>
+      <w:tr>
+        <w:tc>
+          <w:tcPr>
+            <w:tcW w:type="dxa" w:w="2300"/>
+            <w:tcBorders>
+              <w:top w:val="single" w:sz="4" w:space="0" w:color="DDDDDD"/>
+              <w:left w:val="single" w:sz="4" w:space="0" w:color="DDDDDD"/>
+              <w:bottom w:val="single" w:sz="4" w:space="0" w:color="DDDDDD"/>
+              <w:right w:val="single" w:sz="4" w:space="0" w:color="DDDDDD"/>
+            </w:tcBorders>
+            <w:tcMar>
+              <w:top w:w="80" w:type="dxa"/>
+              <w:left w:w="120" w:type="dxa"/>
+              <w:bottom w:w="80" w:type="dxa"/>
+              <w:right w:w="120" w:type="dxa"/>
+            </w:tcMar>
+            <w:vAlign w:val="center"/>
+          </w:tcPr>
+          <w:p>
+            <w:pPr>
+              <w:spacing w:after="0"/>
+            </w:pPr>
+            <w:r>
+              <w:rPr>
+                <w:rFonts w:ascii="Wix Madefor Display" w:hAnsi="Wix Madefor Display" w:eastAsia="Wix Madefor Display"/>
+                <w:b w:val="0"/>
+                <w:color w:val="000000"/>
+                <w:sz w:val="16"/>
+              </w:rPr>
+              <w:t>ic-memo-pipeline</w:t>
+            </w:r>
+          </w:p>
+        </w:tc>
+        <w:tc>
+          <w:tcPr>
+            <w:tcW w:type="dxa" w:w="1700"/>
+            <w:tcBorders>
+              <w:top w:val="single" w:sz="4" w:space="0" w:color="DDDDDD"/>
+              <w:left w:val="single" w:sz="4" w:space="0" w:color="DDDDDD"/>
+              <w:bottom w:val="single" w:sz="4" w:space="0" w:color="DDDDDD"/>
+              <w:right w:val="single" w:sz="4" w:space="0" w:color="DDDDDD"/>
+            </w:tcBorders>
+            <w:tcMar>
+              <w:top w:w="80" w:type="dxa"/>
+              <w:left w:w="120" w:type="dxa"/>
+              <w:bottom w:w="80" w:type="dxa"/>
+              <w:right w:w="120" w:type="dxa"/>
+            </w:tcMar>
+            <w:vAlign w:val="center"/>
+          </w:tcPr>
+          <w:p>
+            <w:pPr>
+              <w:spacing w:after="0"/>
+            </w:pPr>
+            <w:r>
+              <w:rPr>
+                <w:rFonts w:ascii="Wix Madefor Display" w:hAnsi="Wix Madefor Display" w:eastAsia="Wix Madefor Display"/>
+                <w:b w:val="0"/>
+                <w:color w:val="000000"/>
+                <w:sz w:val="16"/>
+              </w:rPr>
+              <w:t>Workflow</w:t>
+            </w:r>
+          </w:p>
+        </w:tc>
+        <w:tc>
+          <w:tcPr>
+            <w:tcW w:type="dxa" w:w="4500"/>
+            <w:tcBorders>
+              <w:top w:val="single" w:sz="4" w:space="0" w:color="DDDDDD"/>
+              <w:left w:val="single" w:sz="4" w:space="0" w:color="DDDDDD"/>
+              <w:bottom w:val="single" w:sz="4" w:space="0" w:color="DDDDDD"/>
+              <w:right w:val="single" w:sz="4" w:space="0" w:color="DDDDDD"/>
+            </w:tcBorders>
+            <w:tcMar>
+              <w:top w:w="80" w:type="dxa"/>
+              <w:left w:w="120" w:type="dxa"/>
+              <w:bottom w:w="80" w:type="dxa"/>
+              <w:right w:w="120" w:type="dxa"/>
+            </w:tcMar>
+            <w:vAlign w:val="center"/>
+          </w:tcPr>
+          <w:p>
+            <w:pPr>
+              <w:spacing w:after="0"/>
+            </w:pPr>
+            <w:r>
+              <w:rPr>
+                <w:rFonts w:ascii="Wix Madefor Display" w:hAnsi="Wix Madefor Display" w:eastAsia="Wix Madefor Display"/>
+                <w:b w:val="0"/>
+                <w:color w:val="000000"/>
+                <w:sz w:val="16"/>
+              </w:rPr>
               <w:t>Runs intake, market research, diligence, draft, quality passes, DOCX output, and QA.</w:t>
             </w:r>
           </w:p>
@@ -2147,7 +2278,6 @@
               <w:bottom w:w="80" w:type="dxa"/>
               <w:right w:w="120" w:type="dxa"/>
             </w:tcMar>
-            <w:shd w:fill="F5F8FF"/>
             <w:vAlign w:val="center"/>
           </w:tcPr>
           <w:p>
@@ -2182,6 +2312,7 @@
               <w:bottom w:w="80" w:type="dxa"/>
               <w:right w:w="120" w:type="dxa"/>
             </w:tcMar>
+            <w:shd w:fill="F5F8FF"/>
             <w:vAlign w:val="center"/>
           </w:tcPr>
           <w:p>
@@ -2214,6 +2345,7 @@
               <w:bottom w:w="80" w:type="dxa"/>
               <w:right w:w="120" w:type="dxa"/>
             </w:tcMar>
+            <w:shd w:fill="F5F8FF"/>
             <w:vAlign w:val="center"/>
           </w:tcPr>
           <w:p>
@@ -2246,6 +2378,7 @@
               <w:bottom w:w="80" w:type="dxa"/>
               <w:right w:w="120" w:type="dxa"/>
             </w:tcMar>
+            <w:shd w:fill="F5F8FF"/>
             <w:vAlign w:val="center"/>
           </w:tcPr>
           <w:p>
@@ -2278,6 +2411,7 @@
               <w:bottom w:w="80" w:type="dxa"/>
               <w:right w:w="120" w:type="dxa"/>
             </w:tcMar>
+            <w:shd w:fill="F5F8FF"/>
             <w:vAlign w:val="center"/>
           </w:tcPr>
           <w:p>
@@ -2312,7 +2446,6 @@
               <w:bottom w:w="80" w:type="dxa"/>
               <w:right w:w="120" w:type="dxa"/>
             </w:tcMar>
-            <w:shd w:fill="F5F8FF"/>
             <w:vAlign w:val="center"/>
           </w:tcPr>
           <w:p>
@@ -2345,7 +2478,6 @@
               <w:bottom w:w="80" w:type="dxa"/>
               <w:right w:w="120" w:type="dxa"/>
             </w:tcMar>
-            <w:shd w:fill="F5F8FF"/>
             <w:vAlign w:val="center"/>
           </w:tcPr>
           <w:p>
@@ -2378,7 +2510,6 @@
               <w:bottom w:w="80" w:type="dxa"/>
               <w:right w:w="120" w:type="dxa"/>
             </w:tcMar>
-            <w:shd w:fill="F5F8FF"/>
             <w:vAlign w:val="center"/>
           </w:tcPr>
           <w:p>
@@ -2411,7 +2542,6 @@
               <w:bottom w:w="80" w:type="dxa"/>
               <w:right w:w="120" w:type="dxa"/>
             </w:tcMar>
-            <w:shd w:fill="F5F8FF"/>
             <w:vAlign w:val="center"/>
           </w:tcPr>
           <w:p>
@@ -2446,6 +2576,7 @@
               <w:bottom w:w="80" w:type="dxa"/>
               <w:right w:w="120" w:type="dxa"/>
             </w:tcMar>
+            <w:shd w:fill="F5F8FF"/>
             <w:vAlign w:val="center"/>
           </w:tcPr>
           <w:p>
@@ -2478,6 +2609,7 @@
               <w:bottom w:w="80" w:type="dxa"/>
               <w:right w:w="120" w:type="dxa"/>
             </w:tcMar>
+            <w:shd w:fill="F5F8FF"/>
             <w:vAlign w:val="center"/>
           </w:tcPr>
           <w:p>
@@ -2510,6 +2642,7 @@
               <w:bottom w:w="80" w:type="dxa"/>
               <w:right w:w="120" w:type="dxa"/>
             </w:tcMar>
+            <w:shd w:fill="F5F8FF"/>
             <w:vAlign w:val="center"/>
           </w:tcPr>
           <w:p>
@@ -2542,6 +2675,7 @@
               <w:bottom w:w="80" w:type="dxa"/>
               <w:right w:w="120" w:type="dxa"/>
             </w:tcMar>
+            <w:shd w:fill="F5F8FF"/>
             <w:vAlign w:val="center"/>
           </w:tcPr>
           <w:p>
@@ -2576,7 +2710,6 @@
               <w:bottom w:w="80" w:type="dxa"/>
               <w:right w:w="120" w:type="dxa"/>
             </w:tcMar>
-            <w:shd w:fill="F5F8FF"/>
             <w:vAlign w:val="center"/>
           </w:tcPr>
           <w:p>
@@ -2609,7 +2742,6 @@
               <w:bottom w:w="80" w:type="dxa"/>
               <w:right w:w="120" w:type="dxa"/>
             </w:tcMar>
-            <w:shd w:fill="F5F8FF"/>
             <w:vAlign w:val="center"/>
           </w:tcPr>
           <w:p>
@@ -2642,7 +2774,6 @@
               <w:bottom w:w="80" w:type="dxa"/>
               <w:right w:w="120" w:type="dxa"/>
             </w:tcMar>
-            <w:shd w:fill="F5F8FF"/>
             <w:vAlign w:val="center"/>
           </w:tcPr>
           <w:p>
@@ -2675,7 +2806,6 @@
               <w:bottom w:w="80" w:type="dxa"/>
               <w:right w:w="120" w:type="dxa"/>
             </w:tcMar>
-            <w:shd w:fill="F5F8FF"/>
             <w:vAlign w:val="center"/>
           </w:tcPr>
           <w:p>
@@ -2710,6 +2840,7 @@
               <w:bottom w:w="80" w:type="dxa"/>
               <w:right w:w="120" w:type="dxa"/>
             </w:tcMar>
+            <w:shd w:fill="F5F8FF"/>
             <w:vAlign w:val="center"/>
           </w:tcPr>
           <w:p>
@@ -2742,6 +2873,7 @@
               <w:bottom w:w="80" w:type="dxa"/>
               <w:right w:w="120" w:type="dxa"/>
             </w:tcMar>
+            <w:shd w:fill="F5F8FF"/>
             <w:vAlign w:val="center"/>
           </w:tcPr>
           <w:p>
@@ -2774,6 +2906,7 @@
               <w:bottom w:w="80" w:type="dxa"/>
               <w:right w:w="120" w:type="dxa"/>
             </w:tcMar>
+            <w:shd w:fill="F5F8FF"/>
             <w:vAlign w:val="center"/>
           </w:tcPr>
           <w:p>
@@ -2806,6 +2939,7 @@
               <w:bottom w:w="80" w:type="dxa"/>
               <w:right w:w="120" w:type="dxa"/>
             </w:tcMar>
+            <w:shd w:fill="F5F8FF"/>
             <w:vAlign w:val="center"/>
           </w:tcPr>
           <w:p>
@@ -2840,7 +2974,6 @@
               <w:bottom w:w="80" w:type="dxa"/>
               <w:right w:w="120" w:type="dxa"/>
             </w:tcMar>
-            <w:shd w:fill="F5F8FF"/>
             <w:vAlign w:val="center"/>
           </w:tcPr>
           <w:p>
@@ -2873,7 +3006,6 @@
               <w:bottom w:w="80" w:type="dxa"/>
               <w:right w:w="120" w:type="dxa"/>
             </w:tcMar>
-            <w:shd w:fill="F5F8FF"/>
             <w:vAlign w:val="center"/>
           </w:tcPr>
           <w:p>
@@ -2906,7 +3038,6 @@
               <w:bottom w:w="80" w:type="dxa"/>
               <w:right w:w="120" w:type="dxa"/>
             </w:tcMar>
-            <w:shd w:fill="F5F8FF"/>
             <w:vAlign w:val="center"/>
           </w:tcPr>
           <w:p>
@@ -2939,7 +3070,6 @@
               <w:bottom w:w="80" w:type="dxa"/>
               <w:right w:w="120" w:type="dxa"/>
             </w:tcMar>
-            <w:shd w:fill="F5F8FF"/>
             <w:vAlign w:val="center"/>
           </w:tcPr>
           <w:p>
@@ -6320,6 +6450,73 @@
                 <w:color w:val="000000"/>
                 <w:sz w:val="16"/>
               </w:rPr>
+              <w:t>Full new deal pack</w:t>
+            </w:r>
+          </w:p>
+        </w:tc>
+        <w:tc>
+          <w:tcPr>
+            <w:tcW w:type="dxa" w:w="7800"/>
+            <w:tcBorders>
+              <w:top w:val="single" w:sz="4" w:space="0" w:color="DDDDDD"/>
+              <w:left w:val="single" w:sz="4" w:space="0" w:color="DDDDDD"/>
+              <w:bottom w:val="single" w:sz="4" w:space="0" w:color="DDDDDD"/>
+              <w:right w:val="single" w:sz="4" w:space="0" w:color="DDDDDD"/>
+            </w:tcBorders>
+            <w:tcMar>
+              <w:top w:w="80" w:type="dxa"/>
+              <w:left w:w="120" w:type="dxa"/>
+              <w:bottom w:w="80" w:type="dxa"/>
+              <w:right w:w="120" w:type="dxa"/>
+            </w:tcMar>
+            <w:vAlign w:val="center"/>
+          </w:tcPr>
+          <w:p>
+            <w:pPr>
+              <w:spacing w:after="0"/>
+            </w:pPr>
+            <w:r>
+              <w:rPr>
+                <w:rFonts w:ascii="Wix Madefor Display" w:hAnsi="Wix Madefor Display" w:eastAsia="Wix Madefor Display"/>
+                <w:b w:val="0"/>
+                <w:color w:val="000000"/>
+                <w:sz w:val="16"/>
+              </w:rPr>
+              <w:t>deal-master -&gt; new-deal-pipeline -&gt; market-research report + competitive assessment + IC memo -&gt; cross-output QA</w:t>
+            </w:r>
+          </w:p>
+        </w:tc>
+      </w:tr>
+      <w:tr>
+        <w:tc>
+          <w:tcPr>
+            <w:tcW w:type="dxa" w:w="3000"/>
+            <w:tcBorders>
+              <w:top w:val="single" w:sz="4" w:space="0" w:color="DDDDDD"/>
+              <w:left w:val="single" w:sz="4" w:space="0" w:color="DDDDDD"/>
+              <w:bottom w:val="single" w:sz="4" w:space="0" w:color="DDDDDD"/>
+              <w:right w:val="single" w:sz="4" w:space="0" w:color="DDDDDD"/>
+            </w:tcBorders>
+            <w:tcMar>
+              <w:top w:w="80" w:type="dxa"/>
+              <w:left w:w="120" w:type="dxa"/>
+              <w:bottom w:w="80" w:type="dxa"/>
+              <w:right w:w="120" w:type="dxa"/>
+            </w:tcMar>
+            <w:shd w:fill="F5F8FF"/>
+            <w:vAlign w:val="center"/>
+          </w:tcPr>
+          <w:p>
+            <w:pPr>
+              <w:spacing w:after="0"/>
+            </w:pPr>
+            <w:r>
+              <w:rPr>
+                <w:rFonts w:ascii="Wix Madefor Display" w:hAnsi="Wix Madefor Display" w:eastAsia="Wix Madefor Display"/>
+                <w:b w:val="0"/>
+                <w:color w:val="000000"/>
+                <w:sz w:val="16"/>
+              </w:rPr>
               <w:t>Standalone finance model</w:t>
             </w:r>
           </w:p>
@@ -6339,6 +6536,7 @@
               <w:bottom w:w="80" w:type="dxa"/>
               <w:right w:w="120" w:type="dxa"/>
             </w:tcMar>
+            <w:shd w:fill="F5F8FF"/>
             <w:vAlign w:val="center"/>
           </w:tcPr>
           <w:p>
@@ -6373,7 +6571,6 @@
               <w:bottom w:w="80" w:type="dxa"/>
               <w:right w:w="120" w:type="dxa"/>
             </w:tcMar>
-            <w:shd w:fill="F5F8FF"/>
             <w:vAlign w:val="center"/>
           </w:tcPr>
           <w:p>
@@ -6406,7 +6603,6 @@
               <w:bottom w:w="80" w:type="dxa"/>
               <w:right w:w="120" w:type="dxa"/>
             </w:tcMar>
-            <w:shd w:fill="F5F8FF"/>
             <w:vAlign w:val="center"/>
           </w:tcPr>
           <w:p>
@@ -6441,6 +6637,7 @@
               <w:bottom w:w="80" w:type="dxa"/>
               <w:right w:w="120" w:type="dxa"/>
             </w:tcMar>
+            <w:shd w:fill="F5F8FF"/>
             <w:vAlign w:val="center"/>
           </w:tcPr>
           <w:p>
@@ -6473,6 +6670,7 @@
               <w:bottom w:w="80" w:type="dxa"/>
               <w:right w:w="120" w:type="dxa"/>
             </w:tcMar>
+            <w:shd w:fill="F5F8FF"/>
             <w:vAlign w:val="center"/>
           </w:tcPr>
           <w:p>
@@ -6507,7 +6705,6 @@
               <w:bottom w:w="80" w:type="dxa"/>
               <w:right w:w="120" w:type="dxa"/>
             </w:tcMar>
-            <w:shd w:fill="F5F8FF"/>
             <w:vAlign w:val="center"/>
           </w:tcPr>
           <w:p>
@@ -6540,7 +6737,6 @@
               <w:bottom w:w="80" w:type="dxa"/>
               <w:right w:w="120" w:type="dxa"/>
             </w:tcMar>
-            <w:shd w:fill="F5F8FF"/>
             <w:vAlign w:val="center"/>
           </w:tcPr>
           <w:p>
@@ -6575,6 +6771,7 @@
               <w:bottom w:w="80" w:type="dxa"/>
               <w:right w:w="120" w:type="dxa"/>
             </w:tcMar>
+            <w:shd w:fill="F5F8FF"/>
             <w:vAlign w:val="center"/>
           </w:tcPr>
           <w:p>
@@ -6607,6 +6804,7 @@
               <w:bottom w:w="80" w:type="dxa"/>
               <w:right w:w="120" w:type="dxa"/>
             </w:tcMar>
+            <w:shd w:fill="F5F8FF"/>
             <w:vAlign w:val="center"/>
           </w:tcPr>
           <w:p>

</xml_diff>